<commit_message>
Pla de màrqueting sencer al capítol 4 i còpies als apartats
Co-Authored-By: Claude Opus 5.5 (1M context) <noreply@anthropic.com>
</commit_message>
<xml_diff>
--- a/PIMPAN_TFM_MUNTATGE.docx
+++ b/PIMPAN_TFM_MUNTATGE.docx
@@ -1390,7 +1390,7 @@
           <wp:inline distT="114300" distB="114300" distL="114300" distR="114300" wp14:anchorId="4BA9AAD4" wp14:editId="470B6B7F">
             <wp:extent cx="4808541" cy="3419792"/>
             <wp:effectExtent l="0" t="0" r="0" b="0"/>
-            <wp:docPr id="7" name="image5.png"/>
+            <wp:docPr id="50001" name="image5.png"/>
             <wp:cNvGraphicFramePr/>
             <a:graphic xmlns:a="http://schemas.openxmlformats.org/drawingml/2006/main">
               <a:graphicData uri="http://schemas.openxmlformats.org/drawingml/2006/picture">
@@ -3079,13 +3079,275 @@
       </w:r>
     </w:p>
     <w:p>
+      <w:pPr>
+        <w:numPr>
+          <w:ilvl w:val="0"/>
+          <w:numId w:val="22"/>
+        </w:numPr>
+        <w:jc w:val="both"/>
+        <w:rPr>
+          <w:b/>
+          <w:bCs/>
+        </w:rPr>
+      </w:pPr>
+      <w:r>
+        <w:rPr>
+          <w:b/>
+          <w:bCs/>
+        </w:rPr>
+        <w:t>Forces competitives: barreres d’entrada/sortida, productes substitutius, poder de negociació de proveïdors i clients.</w:t>
+      </w:r>
+    </w:p>
+    <w:p>
+      <w:pPr>
+        <w:ind w:left="720"/>
+        <w:jc w:val="both"/>
+      </w:pPr>
+      <w:r>
+        <w:t xml:space="preserve">En quant a barreres d’entrada, a l’inici hi trobem com a barrera les principals que es donarien a l’hora d’innovar un producte: </w:t>
+      </w:r>
+    </w:p>
+    <w:p>
+      <w:pPr>
+        <w:numPr>
+          <w:ilvl w:val="0"/>
+          <w:numId w:val="24"/>
+        </w:numPr>
+        <w:spacing w:after="0"/>
+        <w:jc w:val="both"/>
+      </w:pPr>
+      <w:r>
+        <w:t xml:space="preserve">Inversió en disseny i fabricació. </w:t>
+      </w:r>
+    </w:p>
+    <w:p>
+      <w:pPr>
+        <w:numPr>
+          <w:ilvl w:val="0"/>
+          <w:numId w:val="24"/>
+        </w:numPr>
+        <w:spacing w:after="0"/>
+        <w:jc w:val="both"/>
+      </w:pPr>
+      <w:r>
+        <w:t xml:space="preserve">Compliment </w:t>
+      </w:r>
+      <w:proofErr w:type="spellStart"/>
+      <w:r>
+        <w:t>otorgat</w:t>
+      </w:r>
+      <w:proofErr w:type="spellEnd"/>
+      <w:r>
+        <w:t xml:space="preserve"> de la normativa (CE, higiene). </w:t>
+      </w:r>
+    </w:p>
+    <w:p>
+      <w:pPr>
+        <w:numPr>
+          <w:ilvl w:val="0"/>
+          <w:numId w:val="24"/>
+        </w:numPr>
+        <w:jc w:val="both"/>
+      </w:pPr>
+      <w:r>
+        <w:t xml:space="preserve">Necessitat d’un prototip funcional. </w:t>
+      </w:r>
+    </w:p>
+    <w:p>
+      <w:pPr>
+        <w:ind w:left="708"/>
+        <w:jc w:val="both"/>
+      </w:pPr>
+      <w:r>
+        <w:tab/>
+        <w:t xml:space="preserve">La nostra intenció és dissenyar i fabricar la màquina, i que l’empresa de distribució la faci arribar al client final. En el cas que no anés bé, les barreres de sortida serien baixes; doncs és un mercat dinàmic i adaptable. A més, són màquines que es poden reutilitzar o vendre de segona mà per si quedés </w:t>
+      </w:r>
+      <w:proofErr w:type="spellStart"/>
+      <w:r>
+        <w:t>stock</w:t>
+      </w:r>
+      <w:proofErr w:type="spellEnd"/>
+      <w:r>
+        <w:t xml:space="preserve"> i pel que fa a les eines de fabricació, són actius relativament reutilitzables pel que també es podrien vendre. S’hauria de tenir en compte temes de costos legals o contractuals en el cas que tinguem contractes amb distribuïdors. </w:t>
+      </w:r>
+    </w:p>
+    <w:p>
+      <w:pPr>
+        <w:ind w:left="708"/>
+        <w:jc w:val="both"/>
+      </w:pPr>
+      <w:r>
+        <w:t xml:space="preserve">Pel que fa a productes substitutius, el problema és alt. Doncs partim de la base que la gran </w:t>
+      </w:r>
+      <w:proofErr w:type="spellStart"/>
+      <w:r>
+        <w:t>majoría</w:t>
+      </w:r>
+      <w:proofErr w:type="spellEnd"/>
+      <w:r>
+        <w:t xml:space="preserve"> de comerços actualment ja no la utilitza al tractar-se d’un producte innovador. El producte substitutiu que hi pot haver és o bé el ganivet (tall manual com fins ara), o bé utilitzar màquines verticals tradicionals o màquines semblants de tall tipus talla-</w:t>
+      </w:r>
+      <w:proofErr w:type="spellStart"/>
+      <w:r>
+        <w:t>fiambres</w:t>
+      </w:r>
+      <w:proofErr w:type="spellEnd"/>
+      <w:r>
+        <w:t xml:space="preserve">. I per tant, cal demostrar superioritat clara amb PIMPAN. </w:t>
+      </w:r>
+    </w:p>
+    <w:p>
+      <w:pPr>
+        <w:ind w:left="708"/>
+        <w:jc w:val="both"/>
+      </w:pPr>
+      <w:r>
+        <w:t xml:space="preserve">El poder de negociació dins el sector HORECA i amb el distribuïdor, sobretot després que 35 establiments contestessin enquesta, és que la gran </w:t>
+      </w:r>
+      <w:proofErr w:type="spellStart"/>
+      <w:r>
+        <w:t>majoría</w:t>
+      </w:r>
+      <w:proofErr w:type="spellEnd"/>
+      <w:r>
+        <w:t xml:space="preserve"> són sensibles al preu i la seva decisió serà racional (ho han de veure i que quedi demostrat). Indiquem respostes de l’enquesta: </w:t>
+      </w:r>
+    </w:p>
+    <w:p>
+      <w:pPr>
+        <w:jc w:val="both"/>
+      </w:pPr>
+      <w:r>
+        <w:rPr>
+          <w:noProof/>
+        </w:rPr>
+        <w:lastRenderedPageBreak/>
+        <w:drawing>
+          <wp:inline distT="114300" distB="114300" distL="114300" distR="114300" wp14:anchorId="1C27B0DE" wp14:editId="39B9044C">
+            <wp:extent cx="5399730" cy="2451100"/>
+            <wp:effectExtent l="0" t="0" r="0" b="0"/>
+            <wp:docPr id="50002" name="image13.png" descr="Gráfico de respuestas de formularios. Título de la pregunta: Estaríeu disposats a invertir en una màquina específica per automatitzar aquest procés i reduir els temps de preparació?. Número de respuestas: 35 respuestas."/>
+            <wp:cNvGraphicFramePr/>
+            <a:graphic xmlns:a="http://schemas.openxmlformats.org/drawingml/2006/main">
+              <a:graphicData uri="http://schemas.openxmlformats.org/drawingml/2006/picture">
+                <pic:pic xmlns:pic="http://schemas.openxmlformats.org/drawingml/2006/picture">
+                  <pic:nvPicPr>
+                    <pic:cNvPr id="8" name="image13.png" descr="Gráfico de respuestas de formularios. Título de la pregunta: Estaríeu disposats a invertir en una màquina específica per automatitzar aquest procés i reduir els temps de preparació?. Número de respuestas: 35 respuestas."/>
+                    <pic:cNvPicPr preferRelativeResize="0"/>
+                  </pic:nvPicPr>
+                  <pic:blipFill>
+                    <a:blip r:embed="rId17"/>
+                    <a:srcRect/>
+                    <a:stretch>
+                      <a:fillRect/>
+                    </a:stretch>
+                  </pic:blipFill>
+                  <pic:spPr>
+                    <a:xfrm>
+                      <a:off x="0" y="0"/>
+                      <a:ext cx="5399730" cy="2451100"/>
+                    </a:xfrm>
+                    <a:prstGeom prst="rect">
+                      <a:avLst/>
+                    </a:prstGeom>
+                    <a:ln/>
+                  </pic:spPr>
+                </pic:pic>
+              </a:graphicData>
+            </a:graphic>
+          </wp:inline>
+        </w:drawing>
+      </w:r>
+    </w:p>
+    <w:p>
+      <w:pPr>
+        <w:ind w:right="-267" w:firstLine="720"/>
+        <w:jc w:val="both"/>
+      </w:pPr>
+      <w:r>
+        <w:t xml:space="preserve">I a part, exigeixen un preu competitiu: </w:t>
+      </w:r>
+    </w:p>
+    <w:p>
+      <w:pPr>
+        <w:jc w:val="both"/>
+      </w:pPr>
+      <w:r>
+        <w:rPr>
+          <w:noProof/>
+        </w:rPr>
+        <w:drawing>
+          <wp:inline distT="114300" distB="114300" distL="114300" distR="114300" wp14:anchorId="09E6B4AD" wp14:editId="72ADF4E3">
+            <wp:extent cx="5399730" cy="2273300"/>
+            <wp:effectExtent l="0" t="0" r="0" b="0"/>
+            <wp:docPr id="50003" name="image3.png" descr="Gráfico de respuestas de formularios. Título de la pregunta: Quin rang de preu consideraries acceptable per a una maquinària d'aquestes característiques?. Número de respuestas: 35 respuestas."/>
+            <wp:cNvGraphicFramePr/>
+            <a:graphic xmlns:a="http://schemas.openxmlformats.org/drawingml/2006/main">
+              <a:graphicData uri="http://schemas.openxmlformats.org/drawingml/2006/picture">
+                <pic:pic xmlns:pic="http://schemas.openxmlformats.org/drawingml/2006/picture">
+                  <pic:nvPicPr>
+                    <pic:cNvPr id="9" name="image3.png" descr="Gráfico de respuestas de formularios. Título de la pregunta: Quin rang de preu consideraries acceptable per a una maquinària d'aquestes característiques?. Número de respuestas: 35 respuestas."/>
+                    <pic:cNvPicPr preferRelativeResize="0"/>
+                  </pic:nvPicPr>
+                  <pic:blipFill>
+                    <a:blip r:embed="rId18"/>
+                    <a:srcRect/>
+                    <a:stretch>
+                      <a:fillRect/>
+                    </a:stretch>
+                  </pic:blipFill>
+                  <pic:spPr>
+                    <a:xfrm>
+                      <a:off x="0" y="0"/>
+                      <a:ext cx="5399730" cy="2273300"/>
+                    </a:xfrm>
+                    <a:prstGeom prst="rect">
+                      <a:avLst/>
+                    </a:prstGeom>
+                    <a:ln/>
+                  </pic:spPr>
+                </pic:pic>
+              </a:graphicData>
+            </a:graphic>
+          </wp:inline>
+        </w:drawing>
+      </w:r>
+    </w:p>
+    <w:p>
+      <w:pPr>
+        <w:jc w:val="both"/>
+      </w:pPr>
+    </w:p>
+    <w:p>
+      <w:pPr>
+        <w:ind w:left="708"/>
+        <w:jc w:val="both"/>
+      </w:pPr>
+      <w:r>
+        <w:t xml:space="preserve">Pel que fa a PIMPAN, que distribuirà amb </w:t>
+      </w:r>
+      <w:proofErr w:type="spellStart"/>
+      <w:r>
+        <w:t>distribuidors</w:t>
+      </w:r>
+      <w:proofErr w:type="spellEnd"/>
+      <w:r>
+        <w:t xml:space="preserve"> HORECA de venda directa. Al dependre del distribuïdor caldrà negociar un marge menor i que sigui de confiança com per tenir un control també menor a llarg termini de la gestió en sí. </w:t>
+      </w:r>
+    </w:p>
+    <w:p>
+      <w:pPr>
+        <w:jc w:val="both"/>
+      </w:pPr>
+    </w:p>
+    <w:p>
       <w:r>
         <w:rPr>
           <w:b/>
           <w:i w:val="0"/>
           <w:color w:val="C00000"/>
         </w:rPr>
-        <w:t>[FALTA] Anàlisi de Porter: no existeix</w:t>
+        <w:t>[FALTA] Revisar si cal completar les cinc forces: hi ha barreres, substitutius i poder de negociació, però no la rivalitat ni l'amenaça de nous entrants com a apartat propi</w:t>
       </w:r>
     </w:p>
     <w:p>
@@ -3130,7 +3392,7 @@
           <wp:inline distT="114300" distB="114300" distL="114300" distR="114300" wp14:anchorId="14C3131F" wp14:editId="1AC14489">
             <wp:extent cx="4516275" cy="4516275"/>
             <wp:effectExtent l="0" t="0" r="0" b="0"/>
-            <wp:docPr id="12" name="image18.png"/>
+            <wp:docPr id="50004" name="image18.png"/>
             <wp:cNvGraphicFramePr/>
             <a:graphic xmlns:a="http://schemas.openxmlformats.org/drawingml/2006/main">
               <a:graphicData uri="http://schemas.openxmlformats.org/drawingml/2006/picture">
@@ -3243,7 +3505,7 @@
           <wp:inline distT="114300" distB="114300" distL="114300" distR="114300" wp14:anchorId="036EFF0F" wp14:editId="543B9A45">
             <wp:extent cx="4563428" cy="4563428"/>
             <wp:effectExtent l="0" t="0" r="0" b="0"/>
-            <wp:docPr id="13" name="image17.png"/>
+            <wp:docPr id="50005" name="image17.png"/>
             <wp:cNvGraphicFramePr/>
             <a:graphic xmlns:a="http://schemas.openxmlformats.org/drawingml/2006/main">
               <a:graphicData uri="http://schemas.openxmlformats.org/drawingml/2006/picture">
@@ -3314,37 +3576,495 @@
       </w:r>
     </w:p>
     <w:p>
+      <w:pPr>
+        <w:ind w:left="720"/>
+      </w:pPr>
+    </w:p>
+    <w:p>
+      <w:pPr>
+        <w:jc w:val="both"/>
+      </w:pPr>
+      <w:r>
+        <w:t xml:space="preserve">L’anàlisi realitzat a nivell intern com extern permet concloure que PIMPAN respon a una necessitat del mercat, cosa que justifica l’existència d’una oportunitat de negoci. </w:t>
+      </w:r>
+    </w:p>
+    <w:p>
+      <w:pPr>
+        <w:jc w:val="both"/>
+      </w:pPr>
+      <w:r>
+        <w:t xml:space="preserve">Tal i com hem vist, actualment la gran majoria dels establiments </w:t>
+      </w:r>
+      <w:proofErr w:type="spellStart"/>
+      <w:r>
+        <w:t>Horeca</w:t>
+      </w:r>
+      <w:proofErr w:type="spellEnd"/>
+      <w:r>
+        <w:t xml:space="preserve"> realitzen el tall dels entrepans de forma manual. Això genera problemes operatius: risc d’accidents, falta d’uniformitat en el pa, consum de temps, </w:t>
+      </w:r>
+      <w:proofErr w:type="spellStart"/>
+      <w:r>
+        <w:t>merma</w:t>
+      </w:r>
+      <w:proofErr w:type="spellEnd"/>
+      <w:r>
+        <w:t xml:space="preserve"> del pa, fatiga del personal. Això indica clarament que existeix una </w:t>
+      </w:r>
+      <w:proofErr w:type="spellStart"/>
+      <w:r>
+        <w:t>ineficiencia</w:t>
+      </w:r>
+      <w:proofErr w:type="spellEnd"/>
+      <w:r>
+        <w:t xml:space="preserve"> en el procés actual, que encara no està solucionada de manera eficient. </w:t>
+      </w:r>
+    </w:p>
+    <w:p>
+      <w:pPr>
+        <w:jc w:val="both"/>
+      </w:pPr>
+      <w:r>
+        <w:t xml:space="preserve">Hi ha una tendència a l’augment del consum fora de casa i un consum recurrent i estable. Això garanteix una base de clients suficient i estable per a la introducció del producte. </w:t>
+      </w:r>
+    </w:p>
+    <w:p>
+      <w:pPr>
+        <w:jc w:val="both"/>
+      </w:pPr>
+      <w:r>
+        <w:t xml:space="preserve">Cal tenir en compte que una condició clau per </w:t>
+      </w:r>
+      <w:proofErr w:type="spellStart"/>
+      <w:r>
+        <w:t>validad</w:t>
+      </w:r>
+      <w:proofErr w:type="spellEnd"/>
+      <w:r>
+        <w:t xml:space="preserve"> l’oportunitat és que cal destacar un factor crític, que és que el principal substitut és el tall manual (cost 0€). Per tant, l’oportunitat de negoci </w:t>
+      </w:r>
+      <w:proofErr w:type="spellStart"/>
+      <w:r>
+        <w:t>depen</w:t>
+      </w:r>
+      <w:proofErr w:type="spellEnd"/>
+      <w:r>
+        <w:t xml:space="preserve"> de la capacitat de demostrar el valor del producte, evidenciar l’estalvi de temps i costos i facilitat d’ús al client. </w:t>
+      </w:r>
+    </w:p>
+    <w:p>
+      <w:pPr>
+        <w:jc w:val="both"/>
+      </w:pPr>
+      <w:r>
+        <w:t xml:space="preserve">Existeix una oportunitat de mercat per a PIMPAN. Però PIMPAN no neix per crear una necessitat nova, sinó per millorar de manera significativa un procés que actualment ja existeix però és ineficient. </w:t>
+      </w:r>
+    </w:p>
+    <w:p>
+      <w:pPr>
+        <w:jc w:val="both"/>
+      </w:pPr>
+    </w:p>
+    <w:p>
       <w:r>
         <w:rPr>
           <w:b/>
           <w:i w:val="0"/>
           <w:color w:val="C00000"/>
         </w:rPr>
-        <w:t>[FALTA] Formulació estratègica</w:t>
-      </w:r>
-    </w:p>
-    <w:p>
-      <w:r>
+        <w:t>[FALTA] Factors Crítics d'Èxit formulats com a llista: el text només en menciona un (el tall manual com a substitut)</w:t>
+      </w:r>
+    </w:p>
+    <w:p>
+      <w:r>
+        <w:br w:type="page"/>
+      </w:r>
+    </w:p>
+    <w:p>
+      <w:pPr>
+        <w:pStyle w:val="Heading1"/>
+      </w:pPr>
+      <w:r>
+        <w:t>4. PLA DE MÀRQUETING</w:t>
+      </w:r>
+    </w:p>
+    <w:p>
+      <w:pPr>
+        <w:pStyle w:val="Heading2"/>
+        <w:numPr>
+          <w:ilvl w:val="0"/>
+          <w:numId w:val="10"/>
+        </w:numPr>
         <w:rPr>
           <w:b/>
-          <w:i w:val="0"/>
-          <w:color w:val="C00000"/>
+          <w:bCs/>
         </w:rPr>
-        <w:t>[FALTA] Factors Crítics d'Èxit</w:t>
-      </w:r>
-    </w:p>
-    <w:p>
-      <w:r>
-        <w:br w:type="page"/>
-      </w:r>
-    </w:p>
-    <w:p>
-      <w:pPr>
-        <w:pStyle w:val="Heading1"/>
-      </w:pPr>
-      <w:r>
-        <w:t>4. PLA DE MÀRQUETING</w:t>
-      </w:r>
+      </w:pPr>
+      <w:r>
+        <w:rPr>
+          <w:rFonts w:ascii="Arial" w:eastAsia="Arial" w:hAnsi="Arial" w:cs="Arial"/>
+          <w:b/>
+          <w:bCs/>
+          <w:color w:val="000000"/>
+          <w:sz w:val="36"/>
+          <w:szCs w:val="36"/>
+        </w:rPr>
+        <w:t>Resum executiu</w:t>
+      </w:r>
+    </w:p>
+    <w:p>
+      <w:pPr>
+        <w:ind w:left="720"/>
+        <w:jc w:val="both"/>
+        <w:rPr>
+          <w:b/>
+          <w:bCs/>
+        </w:rPr>
+      </w:pPr>
+    </w:p>
+    <w:p>
+      <w:pPr>
+        <w:pStyle w:val="Heading3"/>
+        <w:jc w:val="both"/>
+        <w:rPr>
+          <w:rFonts w:ascii="Arial" w:eastAsia="Arial" w:hAnsi="Arial" w:cs="Arial"/>
+          <w:color w:val="000000"/>
+        </w:rPr>
+      </w:pPr>
+      <w:r>
+        <w:rPr>
+          <w:rFonts w:ascii="Arial" w:eastAsia="Arial" w:hAnsi="Arial" w:cs="Arial"/>
+          <w:color w:val="000000"/>
+        </w:rPr>
+        <w:t>1.1 Presentació de l’empresa.</w:t>
+      </w:r>
+    </w:p>
+    <w:p>
+      <w:pPr>
+        <w:jc w:val="both"/>
+        <w:rPr>
+          <w:color w:val="45B0E1"/>
+        </w:rPr>
+      </w:pPr>
+    </w:p>
+    <w:p>
+      <w:pPr>
+        <w:jc w:val="both"/>
+      </w:pPr>
+      <w:r>
+        <w:t>La nostra empresa, PIMPAN dissenya i comercialitza màquines de tall horitzontal de barres de pa, oferint una solució innovadora per a l'ús professional. Revolucionem la forma de preparar entrepans, amb una solució que combina velocitat, seguretat i qualitat de tall.</w:t>
+      </w:r>
+    </w:p>
+    <w:p>
+      <w:pPr>
+        <w:jc w:val="both"/>
+      </w:pPr>
+    </w:p>
+    <w:p>
+      <w:pPr>
+        <w:pStyle w:val="Heading3"/>
+        <w:jc w:val="both"/>
+        <w:rPr>
+          <w:rFonts w:ascii="Arial" w:eastAsia="Arial" w:hAnsi="Arial" w:cs="Arial"/>
+          <w:color w:val="000000"/>
+        </w:rPr>
+      </w:pPr>
+      <w:r>
+        <w:rPr>
+          <w:rFonts w:ascii="Arial" w:eastAsia="Arial" w:hAnsi="Arial" w:cs="Arial"/>
+          <w:color w:val="000000"/>
+        </w:rPr>
+        <w:t>1.2 Motivació que impulsa la seva realització</w:t>
+      </w:r>
+    </w:p>
+    <w:p>
+      <w:pPr>
+        <w:jc w:val="both"/>
+        <w:rPr>
+          <w:color w:val="45B0E1"/>
+        </w:rPr>
+      </w:pPr>
+    </w:p>
+    <w:p>
+      <w:pPr>
+        <w:jc w:val="both"/>
+      </w:pPr>
+      <w:r>
+        <w:t xml:space="preserve">Després dels problemes detectats per un dels components del grup, es va fer un sondeig i trobar que no hi ha cap </w:t>
+      </w:r>
+      <w:proofErr w:type="spellStart"/>
+      <w:r>
+        <w:t>máquina</w:t>
+      </w:r>
+      <w:proofErr w:type="spellEnd"/>
+      <w:r>
+        <w:t xml:space="preserve"> en el mercat que ofereix un tall horitzontal de barres de pa.</w:t>
+      </w:r>
+    </w:p>
+    <w:p>
+      <w:pPr>
+        <w:jc w:val="both"/>
+      </w:pPr>
+      <w:r>
+        <w:t xml:space="preserve">Problemes reals identificats amb un tall manual: </w:t>
+      </w:r>
+    </w:p>
+    <w:p>
+      <w:pPr>
+        <w:numPr>
+          <w:ilvl w:val="0"/>
+          <w:numId w:val="11"/>
+        </w:numPr>
+        <w:pBdr>
+          <w:top w:val="nil"/>
+          <w:left w:val="nil"/>
+          <w:bottom w:val="nil"/>
+          <w:right w:val="nil"/>
+          <w:between w:val="nil"/>
+        </w:pBdr>
+        <w:spacing w:after="0"/>
+        <w:jc w:val="both"/>
+      </w:pPr>
+      <w:r>
+        <w:t>Hi ha risc de talls i accidents</w:t>
+      </w:r>
+    </w:p>
+    <w:p>
+      <w:pPr>
+        <w:numPr>
+          <w:ilvl w:val="0"/>
+          <w:numId w:val="11"/>
+        </w:numPr>
+        <w:pBdr>
+          <w:top w:val="nil"/>
+          <w:left w:val="nil"/>
+          <w:bottom w:val="nil"/>
+          <w:right w:val="nil"/>
+          <w:between w:val="nil"/>
+        </w:pBdr>
+        <w:spacing w:after="0"/>
+        <w:jc w:val="both"/>
+      </w:pPr>
+      <w:r>
+        <w:t>Pèrdua de temps per la ineficiència</w:t>
+      </w:r>
+    </w:p>
+    <w:p>
+      <w:pPr>
+        <w:numPr>
+          <w:ilvl w:val="0"/>
+          <w:numId w:val="11"/>
+        </w:numPr>
+        <w:pBdr>
+          <w:top w:val="nil"/>
+          <w:left w:val="nil"/>
+          <w:bottom w:val="nil"/>
+          <w:right w:val="nil"/>
+          <w:between w:val="nil"/>
+        </w:pBdr>
+        <w:spacing w:after="0"/>
+        <w:jc w:val="both"/>
+      </w:pPr>
+      <w:r>
+        <w:t>Brutícia amb moltes engrunes</w:t>
+      </w:r>
+    </w:p>
+    <w:p>
+      <w:pPr>
+        <w:numPr>
+          <w:ilvl w:val="0"/>
+          <w:numId w:val="11"/>
+        </w:numPr>
+        <w:pBdr>
+          <w:top w:val="nil"/>
+          <w:left w:val="nil"/>
+          <w:bottom w:val="nil"/>
+          <w:right w:val="nil"/>
+          <w:between w:val="nil"/>
+        </w:pBdr>
+        <w:jc w:val="both"/>
+      </w:pPr>
+      <w:r>
+        <w:t>Talls no uniformes.</w:t>
+      </w:r>
+    </w:p>
+    <w:p>
+      <w:pPr>
+        <w:jc w:val="both"/>
+      </w:pPr>
+    </w:p>
+    <w:p>
+      <w:pPr>
+        <w:pStyle w:val="Heading3"/>
+        <w:jc w:val="both"/>
+        <w:rPr>
+          <w:rFonts w:ascii="Arial" w:eastAsia="Arial" w:hAnsi="Arial" w:cs="Arial"/>
+          <w:color w:val="000000"/>
+        </w:rPr>
+      </w:pPr>
+      <w:r>
+        <w:rPr>
+          <w:rFonts w:ascii="Arial" w:eastAsia="Arial" w:hAnsi="Arial" w:cs="Arial"/>
+          <w:color w:val="000000"/>
+        </w:rPr>
+        <w:t>1.3 Objectius del projecte</w:t>
+      </w:r>
+    </w:p>
+    <w:p>
+      <w:pPr>
+        <w:jc w:val="both"/>
+        <w:rPr>
+          <w:color w:val="45B0E1"/>
+        </w:rPr>
+      </w:pPr>
+    </w:p>
+    <w:p>
+      <w:pPr>
+        <w:jc w:val="both"/>
+      </w:pPr>
+      <w:r>
+        <w:t>Fer arribar als clients una màquina que els faci estalviar temps, amb més seguretat per l’operari, amb tall uniformes, de neteja fàcil i sense necessitat de formacions.</w:t>
+      </w:r>
+    </w:p>
+    <w:p>
+      <w:pPr>
+        <w:jc w:val="both"/>
+      </w:pPr>
+    </w:p>
+    <w:p>
+      <w:pPr>
+        <w:pStyle w:val="Heading3"/>
+        <w:jc w:val="both"/>
+        <w:rPr>
+          <w:rFonts w:ascii="Arial" w:eastAsia="Arial" w:hAnsi="Arial" w:cs="Arial"/>
+          <w:color w:val="000000"/>
+        </w:rPr>
+      </w:pPr>
+      <w:r>
+        <w:rPr>
+          <w:rFonts w:ascii="Arial" w:eastAsia="Arial" w:hAnsi="Arial" w:cs="Arial"/>
+          <w:color w:val="000000"/>
+        </w:rPr>
+        <w:t>1.4 Oportunitat de mercat</w:t>
+      </w:r>
+    </w:p>
+    <w:p>
+      <w:pPr>
+        <w:jc w:val="both"/>
+        <w:rPr>
+          <w:color w:val="45B0E1"/>
+        </w:rPr>
+      </w:pPr>
+    </w:p>
+    <w:p>
+      <w:pPr>
+        <w:jc w:val="both"/>
+      </w:pPr>
+      <w:r>
+        <w:t>No hi ha competència. No existeixen màquines similars en el mercat del sector  HORECA.</w:t>
+      </w:r>
+    </w:p>
+    <w:p>
+      <w:pPr>
+        <w:jc w:val="both"/>
+      </w:pPr>
+      <w:r>
+        <w:t xml:space="preserve">A més, l’enquesta realitzada a professionals del sector mostra que els establiments continuen realitzant el tall dels entrepans de forma manual. Aquesta situació provoca problemes relacions amb la seguretat laboral, la manca d’uniformitat dels productes i el temps dedicat a la preparació dels entrepans. </w:t>
+      </w:r>
+    </w:p>
+    <w:p>
+      <w:pPr>
+        <w:jc w:val="both"/>
+      </w:pPr>
+      <w:r>
+        <w:t xml:space="preserve">PIMPAN ofereix una màquina compacta, segura i fàcil d’utilitzar que automatitza el procés de tall del pa, millorant la productivitat i reduint els riscos laborals. A diferència d’altres solucions existents, la proposta està especialment orientada a bars, cafeteries, fleques i establiments amb un volum d’entrepans. L’oportunitat també es veu reforçada per l’existència d’un nínxol de mercat encara poc explotat. Les màquines de tall acostumen a estar </w:t>
+      </w:r>
+      <w:proofErr w:type="spellStart"/>
+      <w:r>
+        <w:t>roientades</w:t>
+      </w:r>
+      <w:proofErr w:type="spellEnd"/>
+      <w:r>
+        <w:t xml:space="preserve"> a entorns industrials o de grans dimensions, mentre que PIMPAN se centra en les necessitats específiques dels petits i mitjans negocis HORECA. </w:t>
+      </w:r>
+    </w:p>
+    <w:p>
+      <w:pPr>
+        <w:jc w:val="both"/>
+      </w:pPr>
+      <w:r>
+        <w:t xml:space="preserve">No obstant això, el principal repte és la presència del tall manual com a producte substitutiu, ja que representa una alternativa sense cost inicial. Per aquest motiu, l’èxit de PIMPAN serà demostrat per l’estalvi de temps, la uniformitat del tall i sobretot, la seguretat. </w:t>
+      </w:r>
+    </w:p>
+    <w:p>
+      <w:pPr>
+        <w:jc w:val="both"/>
+      </w:pPr>
+    </w:p>
+    <w:p>
+      <w:pPr>
+        <w:pStyle w:val="Heading3"/>
+        <w:jc w:val="both"/>
+        <w:rPr>
+          <w:rFonts w:ascii="Arial" w:eastAsia="Arial" w:hAnsi="Arial" w:cs="Arial"/>
+          <w:color w:val="000000"/>
+        </w:rPr>
+      </w:pPr>
+      <w:r>
+        <w:rPr>
+          <w:rFonts w:ascii="Arial" w:eastAsia="Arial" w:hAnsi="Arial" w:cs="Arial"/>
+          <w:color w:val="000000"/>
+        </w:rPr>
+        <w:t xml:space="preserve">1.5 Concepte de producte i </w:t>
+      </w:r>
+      <w:r>
+        <w:rPr>
+          <w:rFonts w:ascii="Arial" w:eastAsia="Arial" w:hAnsi="Arial" w:cs="Arial"/>
+          <w:b/>
+          <w:bCs/>
+          <w:color w:val="000000"/>
+        </w:rPr>
+        <w:t xml:space="preserve">proposta de valor </w:t>
+      </w:r>
+      <w:r>
+        <w:rPr>
+          <w:rFonts w:ascii="Arial" w:eastAsia="Arial" w:hAnsi="Arial" w:cs="Arial"/>
+          <w:color w:val="000000"/>
+        </w:rPr>
+        <w:t>derivada.</w:t>
+      </w:r>
+    </w:p>
+    <w:p>
+      <w:pPr>
+        <w:rPr>
+          <w:color w:val="45B0E1"/>
+        </w:rPr>
+      </w:pPr>
+    </w:p>
+    <w:p>
+      <w:r>
+        <w:t>El nostre producte és un dispositiu innovador dissenyat per tallar barres de pa en sentit horitzontal i vertical.</w:t>
+      </w:r>
+    </w:p>
+    <w:p>
+      <w:pPr>
+        <w:jc w:val="both"/>
+      </w:pPr>
+      <w:r>
+        <w:rPr>
+          <w:b/>
+          <w:bCs/>
+        </w:rPr>
+        <w:t>La nostra proposta de valor</w:t>
+      </w:r>
+      <w:r>
+        <w:t xml:space="preserve"> és una solució innovadora única per poder tallar barres de pa en horitzontal, per establiments del sector HORECA que actualment fan el tall manualment i així podran preparar entrepans de forma segura, ràpida, de fàcil de netejar, amb qualitat de tall i de manera uniforme.</w:t>
+      </w:r>
+    </w:p>
+    <w:p>
+      <w:pPr>
+        <w:jc w:val="both"/>
+      </w:pPr>
     </w:p>
     <w:p>
       <w:pPr>
@@ -3375,8 +4095,6 @@
           <w:bCs/>
         </w:rPr>
       </w:pPr>
-      <w:bookmarkStart w:id="7" w:name="_heading=h.avmqkelg9owg" w:colFirst="0" w:colLast="0"/>
-      <w:bookmarkEnd w:id="7"/>
       <w:r>
         <w:rPr>
           <w:rFonts w:ascii="Arial" w:eastAsia="Arial" w:hAnsi="Arial" w:cs="Arial"/>
@@ -3408,8 +4126,6 @@
           <w:color w:val="000000"/>
         </w:rPr>
       </w:pPr>
-      <w:bookmarkStart w:id="8" w:name="_heading=h.e2a5299kmh5y" w:colFirst="0" w:colLast="0"/>
-      <w:bookmarkEnd w:id="8"/>
       <w:r>
         <w:rPr>
           <w:rFonts w:ascii="Arial" w:eastAsia="Arial" w:hAnsi="Arial" w:cs="Arial"/>
@@ -3432,6 +4148,140 @@
       </w:pPr>
       <w:r>
         <w:t xml:space="preserve">El projecte s’emmarca dins el sector de l’alimentació i els utensilis/electrodomèstics de cuina. L’àmbit d’actuació se centra principalment en l’entorn d’HORECA, oferint una solució pràctica, segura i eficient per a la preparació d’entrepans amb la diferència que en aquest cas, el tall que proporciona la màquina és horitzontal, convertint-ho en producte innovador. </w:t>
+      </w:r>
+    </w:p>
+    <w:p>
+      <w:pPr>
+        <w:pStyle w:val="Heading3"/>
+        <w:jc w:val="both"/>
+        <w:rPr>
+          <w:rFonts w:ascii="Arial" w:eastAsia="Arial" w:hAnsi="Arial" w:cs="Arial"/>
+          <w:color w:val="000000"/>
+        </w:rPr>
+      </w:pPr>
+      <w:r>
+        <w:br/>
+      </w:r>
+      <w:r>
+        <w:rPr>
+          <w:rFonts w:ascii="Arial" w:eastAsia="Arial" w:hAnsi="Arial" w:cs="Arial"/>
+          <w:color w:val="000000"/>
+        </w:rPr>
+        <w:t>2.2 Cultura corporativa: Missió, visió i valors corporatius</w:t>
+      </w:r>
+    </w:p>
+    <w:p>
+      <w:pPr>
+        <w:jc w:val="both"/>
+        <w:rPr>
+          <w:b/>
+          <w:bCs/>
+          <w:color w:val="45B0E1"/>
+        </w:rPr>
+      </w:pPr>
+    </w:p>
+    <w:p>
+      <w:pPr>
+        <w:jc w:val="both"/>
+        <w:rPr>
+          <w:b/>
+          <w:bCs/>
+        </w:rPr>
+      </w:pPr>
+      <w:r>
+        <w:rPr>
+          <w:b/>
+          <w:bCs/>
+        </w:rPr>
+        <w:t>Missió</w:t>
+      </w:r>
+    </w:p>
+    <w:p>
+      <w:pPr>
+        <w:spacing w:after="0"/>
+        <w:jc w:val="both"/>
+      </w:pPr>
+      <w:r>
+        <w:t>Oferim un producte adequat a les necessitats dels nostres clients.</w:t>
+      </w:r>
+    </w:p>
+    <w:p>
+      <w:pPr>
+        <w:spacing w:after="0"/>
+        <w:jc w:val="both"/>
+      </w:pPr>
+      <w:r>
+        <w:t>Treballem de manera constant i impliquem a tota l'organització.</w:t>
+      </w:r>
+    </w:p>
+    <w:p>
+      <w:pPr>
+        <w:jc w:val="both"/>
+        <w:rPr>
+          <w:b/>
+          <w:bCs/>
+        </w:rPr>
+      </w:pPr>
+    </w:p>
+    <w:p>
+      <w:pPr>
+        <w:jc w:val="both"/>
+        <w:rPr>
+          <w:b/>
+          <w:bCs/>
+        </w:rPr>
+      </w:pPr>
+      <w:r>
+        <w:rPr>
+          <w:b/>
+          <w:bCs/>
+        </w:rPr>
+        <w:t>Visió</w:t>
+      </w:r>
+    </w:p>
+    <w:p>
+      <w:pPr>
+        <w:jc w:val="both"/>
+      </w:pPr>
+      <w:r>
+        <w:t>Volem ser referent en la maquinària de tall. Apostem per la qualitat dels nostres productes reduint l’impacte ambiental. Donem prioritat al tracte humà en la relació amb els nostres clients i col·laboradors, essent fidels als nostres valors.</w:t>
+      </w:r>
+    </w:p>
+    <w:p>
+      <w:pPr>
+        <w:jc w:val="both"/>
+      </w:pPr>
+    </w:p>
+    <w:p>
+      <w:pPr>
+        <w:jc w:val="both"/>
+        <w:rPr>
+          <w:b/>
+          <w:bCs/>
+        </w:rPr>
+      </w:pPr>
+      <w:r>
+        <w:rPr>
+          <w:b/>
+          <w:bCs/>
+        </w:rPr>
+        <w:t>Valors</w:t>
+      </w:r>
+    </w:p>
+    <w:p>
+      <w:pPr>
+        <w:jc w:val="both"/>
+      </w:pPr>
+      <w:r>
+        <w:t xml:space="preserve">Respecte, confiança, compromís i </w:t>
+      </w:r>
+      <w:proofErr w:type="spellStart"/>
+      <w:r>
+        <w:t>búsqueda</w:t>
+      </w:r>
+      <w:proofErr w:type="spellEnd"/>
+      <w:r>
+        <w:t xml:space="preserve"> de l’excel·lència.</w:t>
       </w:r>
     </w:p>
     <w:p>
@@ -3445,8 +4295,6 @@
           <w:szCs w:val="36"/>
         </w:rPr>
       </w:pPr>
-      <w:bookmarkStart w:id="10" w:name="_heading=h.i2khric48gm0" w:colFirst="0" w:colLast="0"/>
-      <w:bookmarkEnd w:id="10"/>
       <w:r>
         <w:lastRenderedPageBreak/>
         <w:br/>
@@ -3499,8 +4347,6 @@
           <w:color w:val="000000"/>
         </w:rPr>
       </w:pPr>
-      <w:bookmarkStart w:id="11" w:name="_heading=h.ky5ji7t2vv9h" w:colFirst="0" w:colLast="0"/>
-      <w:bookmarkEnd w:id="11"/>
       <w:r>
         <w:rPr>
           <w:rFonts w:ascii="Arial" w:eastAsia="Arial" w:hAnsi="Arial" w:cs="Arial"/>
@@ -3536,8 +4382,6 @@
           <w:color w:val="000000"/>
         </w:rPr>
       </w:pPr>
-      <w:bookmarkStart w:id="12" w:name="_heading=h.d36eg9qwueej" w:colFirst="0" w:colLast="0"/>
-      <w:bookmarkEnd w:id="12"/>
       <w:r>
         <w:br/>
       </w:r>
@@ -3638,8 +4482,6 @@
           <w:color w:val="000000"/>
         </w:rPr>
       </w:pPr>
-      <w:bookmarkStart w:id="13" w:name="_heading=h.dxmq545vo5yh" w:colFirst="0" w:colLast="0"/>
-      <w:bookmarkEnd w:id="13"/>
       <w:r>
         <w:br/>
       </w:r>
@@ -3691,8 +4533,6 @@
         <w:pStyle w:val="Heading4"/>
         <w:jc w:val="both"/>
       </w:pPr>
-      <w:bookmarkStart w:id="15" w:name="_heading=h.pkye5atxe059" w:colFirst="0" w:colLast="0"/>
-      <w:bookmarkEnd w:id="15"/>
       <w:r>
         <w:rPr>
           <w:rFonts w:ascii="Arial" w:eastAsia="Arial" w:hAnsi="Arial" w:cs="Arial"/>
@@ -3759,8 +4599,6 @@
           <w:color w:val="000000"/>
         </w:rPr>
       </w:pPr>
-      <w:bookmarkStart w:id="16" w:name="_heading=h.oturka31kjda" w:colFirst="0" w:colLast="0"/>
-      <w:bookmarkEnd w:id="16"/>
       <w:r>
         <w:rPr>
           <w:rFonts w:ascii="Arial" w:eastAsia="Arial" w:hAnsi="Arial" w:cs="Arial"/>
@@ -3779,8 +4617,6 @@
           <w:color w:val="000000"/>
         </w:rPr>
       </w:pPr>
-      <w:bookmarkStart w:id="17" w:name="_heading=h.lhjevl6mb27g" w:colFirst="0" w:colLast="0"/>
-      <w:bookmarkEnd w:id="17"/>
       <w:r>
         <w:rPr>
           <w:rFonts w:ascii="Arial" w:eastAsia="Arial" w:hAnsi="Arial" w:cs="Arial"/>
@@ -3826,7 +4662,7 @@
           <wp:inline distT="114300" distB="114300" distL="114300" distR="114300" wp14:anchorId="202DA579" wp14:editId="1231D4F9">
             <wp:extent cx="5399730" cy="2273300"/>
             <wp:effectExtent l="0" t="0" r="0" b="0"/>
-            <wp:docPr id="1" name="image8.png" descr="Gràfic de respostes de Formularis. Títol de la pregunta: Com realitzeu actualment el tall de l'entrepà?. Nombre de respostes: 35 respostes."/>
+            <wp:docPr id="50006" name="image8.png" descr="Gràfic de respostes de Formularis. Títol de la pregunta: Com realitzeu actualment el tall de l'entrepà?. Nombre de respostes: 35 respostes."/>
             <wp:cNvGraphicFramePr/>
             <a:graphic xmlns:a="http://schemas.openxmlformats.org/drawingml/2006/main">
               <a:graphicData uri="http://schemas.openxmlformats.org/drawingml/2006/picture">
@@ -3937,7 +4773,7 @@
           <wp:inline distT="114300" distB="114300" distL="114300" distR="114300" wp14:anchorId="1CC41FEA" wp14:editId="2B09041D">
             <wp:extent cx="5399730" cy="2565400"/>
             <wp:effectExtent l="0" t="0" r="0" b="0"/>
-            <wp:docPr id="2" name="image16.png" descr="Gràfic de respostes de Formularis. Títol de la pregunta: Quins són els principals problemes que detectes en el tall manual? &#10;. Nombre de respostes: 35 respostes."/>
+            <wp:docPr id="50007" name="image16.png" descr="Gràfic de respostes de Formularis. Títol de la pregunta: Quins són els principals problemes que detectes en el tall manual? &#10;. Nombre de respostes: 35 respostes."/>
             <wp:cNvGraphicFramePr/>
             <a:graphic xmlns:a="http://schemas.openxmlformats.org/drawingml/2006/main">
               <a:graphicData uri="http://schemas.openxmlformats.org/drawingml/2006/picture">
@@ -4035,7 +4871,7 @@
           <wp:inline distT="114300" distB="114300" distL="114300" distR="114300" wp14:anchorId="13EF978B" wp14:editId="69955C27">
             <wp:extent cx="5399730" cy="2565400"/>
             <wp:effectExtent l="0" t="0" r="0" b="0"/>
-            <wp:docPr id="3" name="image9.png" descr="Gràfic de respostes de Formularis. Títol de la pregunta: Quines característiques valoraries més en aquesta màquina? &#10;&#10;. Nombre de respostes: 35 respostes."/>
+            <wp:docPr id="50008" name="image9.png" descr="Gràfic de respostes de Formularis. Títol de la pregunta: Quines característiques valoraries més en aquesta màquina? &#10;&#10;. Nombre de respostes: 35 respostes."/>
             <wp:cNvGraphicFramePr/>
             <a:graphic xmlns:a="http://schemas.openxmlformats.org/drawingml/2006/main">
               <a:graphicData uri="http://schemas.openxmlformats.org/drawingml/2006/picture">
@@ -4086,8 +4922,6 @@
         <w:pStyle w:val="Heading4"/>
         <w:jc w:val="both"/>
       </w:pPr>
-      <w:bookmarkStart w:id="18" w:name="_heading=h.78489yu8o6zs" w:colFirst="0" w:colLast="0"/>
-      <w:bookmarkEnd w:id="18"/>
       <w:r>
         <w:rPr>
           <w:rFonts w:ascii="Arial" w:eastAsia="Arial" w:hAnsi="Arial" w:cs="Arial"/>
@@ -4153,7 +4987,7 @@
           <wp:inline distT="0" distB="0" distL="0" distR="0" wp14:anchorId="21FD27E6" wp14:editId="07F07355">
             <wp:extent cx="3790415" cy="2572067"/>
             <wp:effectExtent l="0" t="0" r="0" b="0"/>
-            <wp:docPr id="4" name="image15.png"/>
+            <wp:docPr id="50009" name="image15.png"/>
             <wp:cNvGraphicFramePr/>
             <a:graphic xmlns:a="http://schemas.openxmlformats.org/drawingml/2006/main">
               <a:graphicData uri="http://schemas.openxmlformats.org/drawingml/2006/picture">
@@ -4201,8 +5035,6 @@
           <w:color w:val="000000"/>
         </w:rPr>
       </w:pPr>
-      <w:bookmarkStart w:id="19" w:name="_heading=h.wbgbfoyygoiz" w:colFirst="0" w:colLast="0"/>
-      <w:bookmarkEnd w:id="19"/>
       <w:r>
         <w:rPr>
           <w:rFonts w:ascii="Arial" w:eastAsia="Arial" w:hAnsi="Arial" w:cs="Arial"/>
@@ -4451,7 +5283,7 @@
           <wp:inline distT="114300" distB="114300" distL="114300" distR="114300" wp14:anchorId="2E853003" wp14:editId="468FBC67">
             <wp:extent cx="5399730" cy="2273300"/>
             <wp:effectExtent l="0" t="0" r="0" b="0"/>
-            <wp:docPr id="5" name="image1.png" descr="Gràfic de respostes de Formularis. Títol de la pregunta: Quin rang de preu consideraries acceptable per a una maquinària d'aquestes característiques?. Nombre de respostes: 35 respostes."/>
+            <wp:docPr id="50010" name="image1.png" descr="Gràfic de respostes de Formularis. Títol de la pregunta: Quin rang de preu consideraries acceptable per a una maquinària d'aquestes característiques?. Nombre de respostes: 35 respostes."/>
             <wp:cNvGraphicFramePr/>
             <a:graphic xmlns:a="http://schemas.openxmlformats.org/drawingml/2006/main">
               <a:graphicData uri="http://schemas.openxmlformats.org/drawingml/2006/picture">
@@ -4530,7 +5362,7 @@
           <wp:inline distT="114300" distB="114300" distL="114300" distR="114300" wp14:anchorId="133BA90B" wp14:editId="72D0B481">
             <wp:extent cx="5399730" cy="2273300"/>
             <wp:effectExtent l="0" t="0" r="0" b="0"/>
-            <wp:docPr id="6" name="image12.png" descr="Gràfic de respostes de Formularis. Títol de la pregunta: Quants entrepans (aproximadament) prepareu al dia?. Nombre de respostes: 35 respostes."/>
+            <wp:docPr id="50011" name="image12.png" descr="Gràfic de respostes de Formularis. Títol de la pregunta: Quants entrepans (aproximadament) prepareu al dia?. Nombre de respostes: 35 respostes."/>
             <wp:cNvGraphicFramePr/>
             <a:graphic xmlns:a="http://schemas.openxmlformats.org/drawingml/2006/main">
               <a:graphicData uri="http://schemas.openxmlformats.org/drawingml/2006/picture">
@@ -6023,8 +6855,6 @@
           <w:color w:val="000000"/>
         </w:rPr>
       </w:pPr>
-      <w:bookmarkStart w:id="20" w:name="_heading=h.6qya02ck5u9" w:colFirst="0" w:colLast="0"/>
-      <w:bookmarkEnd w:id="20"/>
       <w:r>
         <w:rPr>
           <w:rFonts w:ascii="Arial" w:eastAsia="Arial" w:hAnsi="Arial" w:cs="Arial"/>
@@ -6318,8 +7148,6 @@
           <w:color w:val="000000"/>
         </w:rPr>
       </w:pPr>
-      <w:bookmarkStart w:id="21" w:name="_heading=h.bczq3xwdh1sh" w:colFirst="0" w:colLast="0"/>
-      <w:bookmarkEnd w:id="21"/>
       <w:r>
         <w:rPr>
           <w:rFonts w:ascii="Arial" w:eastAsia="Arial" w:hAnsi="Arial" w:cs="Arial"/>
@@ -6515,8 +7343,6 @@
           <w:color w:val="000000"/>
         </w:rPr>
       </w:pPr>
-      <w:bookmarkStart w:id="22" w:name="_heading=h.mf6rfqbcu3qz" w:colFirst="0" w:colLast="0"/>
-      <w:bookmarkEnd w:id="22"/>
       <w:r>
         <w:rPr>
           <w:rFonts w:ascii="Arial" w:eastAsia="Arial" w:hAnsi="Arial" w:cs="Arial"/>
@@ -7230,8 +8056,6 @@
           <w:szCs w:val="32"/>
         </w:rPr>
       </w:pPr>
-      <w:bookmarkStart w:id="23" w:name="_heading=h.bbcx285elmpi" w:colFirst="0" w:colLast="0"/>
-      <w:bookmarkEnd w:id="23"/>
       <w:r>
         <w:rPr>
           <w:rFonts w:ascii="Arial" w:eastAsia="Arial" w:hAnsi="Arial" w:cs="Arial"/>
@@ -7265,8 +8089,2389 @@
           <w:color w:val="000000"/>
         </w:rPr>
       </w:pPr>
-      <w:bookmarkStart w:id="25" w:name="_heading=h.j412dzboc0qx" w:colFirst="0" w:colLast="0"/>
-      <w:bookmarkEnd w:id="25"/>
+      <w:r>
+        <w:rPr>
+          <w:rFonts w:ascii="Arial" w:eastAsia="Arial" w:hAnsi="Arial" w:cs="Arial"/>
+          <w:b/>
+          <w:bCs/>
+          <w:color w:val="000000"/>
+        </w:rPr>
+        <w:t>3.1 Anàlisi de l’entorn: variables que afecten directament el desenvolupament del projecte</w:t>
+      </w:r>
+      <w:r>
+        <w:rPr>
+          <w:rFonts w:ascii="Arial" w:eastAsia="Arial" w:hAnsi="Arial" w:cs="Arial"/>
+          <w:b/>
+          <w:bCs/>
+          <w:color w:val="000000"/>
+        </w:rPr>
+        <w:t xml:space="preserve"> i PESTEL </w:t>
+      </w:r>
+    </w:p>
+    <w:p/>
+    <w:p>
+      <w:pPr>
+        <w:numPr>
+          <w:ilvl w:val="0"/>
+          <w:numId w:val="15"/>
+        </w:numPr>
+        <w:jc w:val="both"/>
+        <w:rPr>
+          <w:b/>
+          <w:bCs/>
+        </w:rPr>
+      </w:pPr>
+      <w:r>
+        <w:rPr>
+          <w:b/>
+          <w:bCs/>
+        </w:rPr>
+        <w:t xml:space="preserve">Factors polítics: </w:t>
+      </w:r>
+      <w:r>
+        <w:t xml:space="preserve">A nivell polític, ens trobem en una zona en que tant Espanya i Catalunya compten amb polítiques de recolzament al turisme i a </w:t>
+      </w:r>
+      <w:proofErr w:type="spellStart"/>
+      <w:r>
+        <w:t>l’hosteleria</w:t>
+      </w:r>
+      <w:proofErr w:type="spellEnd"/>
+      <w:r>
+        <w:t xml:space="preserve"> ja que es consideren un sector estratègic. Per tant, tot i que amb PIMPAN es comenci per província de Girona podem comptar amb aquest recolzament. </w:t>
+      </w:r>
+    </w:p>
+    <w:p>
+      <w:pPr>
+        <w:ind w:left="720"/>
+        <w:jc w:val="both"/>
+      </w:pPr>
+      <w:r>
+        <w:t xml:space="preserve">A més, també es disposen de programes europeus com les </w:t>
+      </w:r>
+      <w:proofErr w:type="spellStart"/>
+      <w:r>
+        <w:t>Next</w:t>
+      </w:r>
+      <w:proofErr w:type="spellEnd"/>
+      <w:r>
+        <w:t xml:space="preserve"> </w:t>
+      </w:r>
+      <w:proofErr w:type="spellStart"/>
+      <w:r>
+        <w:t>Generations</w:t>
+      </w:r>
+      <w:proofErr w:type="spellEnd"/>
+      <w:r>
+        <w:t xml:space="preserve"> que afavoreixen inversions en maquinària professional. </w:t>
+      </w:r>
+    </w:p>
+    <w:p>
+      <w:pPr>
+        <w:ind w:left="720"/>
+        <w:jc w:val="both"/>
+      </w:pPr>
+      <w:r>
+        <w:t>A nivell polític té un impacte positiu ja que ens facilita la immersió de maquinaria innovadora i es poden optar a subvencions:</w:t>
+      </w:r>
+    </w:p>
+    <w:p>
+      <w:pPr>
+        <w:ind w:left="720"/>
+        <w:jc w:val="both"/>
+      </w:pPr>
+    </w:p>
+    <w:p>
+      <w:pPr>
+        <w:numPr>
+          <w:ilvl w:val="0"/>
+          <w:numId w:val="16"/>
+        </w:numPr>
+        <w:pBdr>
+          <w:top w:val="nil"/>
+          <w:left w:val="nil"/>
+          <w:bottom w:val="nil"/>
+          <w:right w:val="nil"/>
+          <w:between w:val="nil"/>
+        </w:pBdr>
+        <w:jc w:val="both"/>
+      </w:pPr>
+      <w:r>
+        <w:t>Ajuts de la Generalitat – ACCIÓ: per a inversions productives a Catalunya que té com a objectiu donar suport a projectes industrials, inclosa la fabricació de maquinària impulsant projectes d’R+D, innovació i digitalització, donant ajuts per prototipatge, patents i innovació.</w:t>
+      </w:r>
+    </w:p>
+    <w:p>
+      <w:pPr>
+        <w:pBdr>
+          <w:top w:val="nil"/>
+          <w:left w:val="nil"/>
+          <w:bottom w:val="nil"/>
+          <w:right w:val="nil"/>
+          <w:between w:val="nil"/>
+        </w:pBdr>
+        <w:ind w:left="1440"/>
+        <w:jc w:val="both"/>
+      </w:pPr>
+      <w:r>
+        <w:t>Beneficiaris: empreses industrials (CCAE 13–32, inclou el grup CCAE 28 de fabricació de maquinària al qual pertany la nostra empresa), amb seu operativa a Catalunya.</w:t>
+      </w:r>
+    </w:p>
+    <w:p>
+      <w:pPr>
+        <w:pBdr>
+          <w:top w:val="nil"/>
+          <w:left w:val="nil"/>
+          <w:bottom w:val="nil"/>
+          <w:right w:val="nil"/>
+          <w:between w:val="nil"/>
+        </w:pBdr>
+        <w:ind w:left="1440"/>
+        <w:jc w:val="both"/>
+      </w:pPr>
+      <w:r>
+        <w:t xml:space="preserve">La nostra empresa encaixa ja que la nostra màquina, tot i que </w:t>
+      </w:r>
+      <w:proofErr w:type="spellStart"/>
+      <w:r>
+        <w:t>externalitzem</w:t>
+      </w:r>
+      <w:proofErr w:type="spellEnd"/>
+      <w:r>
+        <w:t xml:space="preserve"> la fabricació, es considera un producte industrial per </w:t>
+      </w:r>
+      <w:r>
+        <w:lastRenderedPageBreak/>
+        <w:t>què desenvolupem la nostra pròpia tecnologia innovadora i amb potencial de creixement i de crear llocs de treball.</w:t>
+      </w:r>
+    </w:p>
+    <w:p>
+      <w:pPr>
+        <w:pBdr>
+          <w:top w:val="nil"/>
+          <w:left w:val="nil"/>
+          <w:bottom w:val="nil"/>
+          <w:right w:val="nil"/>
+          <w:between w:val="nil"/>
+        </w:pBdr>
+        <w:ind w:left="1440"/>
+        <w:jc w:val="both"/>
+      </w:pPr>
+      <w:r>
+        <w:t>L’ajut és d’un 20% de la inversió en prototipatge, maquinària, enginyeria i industrialització. Passos a seguir per optar aquesta subvenció a l’Annex I</w:t>
+      </w:r>
+    </w:p>
+    <w:p>
+      <w:pPr>
+        <w:pBdr>
+          <w:top w:val="nil"/>
+          <w:left w:val="nil"/>
+          <w:bottom w:val="nil"/>
+          <w:right w:val="nil"/>
+          <w:between w:val="nil"/>
+        </w:pBdr>
+        <w:ind w:left="1440"/>
+        <w:jc w:val="both"/>
+      </w:pPr>
+    </w:p>
+    <w:p>
+      <w:pPr>
+        <w:numPr>
+          <w:ilvl w:val="0"/>
+          <w:numId w:val="17"/>
+        </w:numPr>
+        <w:pBdr>
+          <w:top w:val="nil"/>
+          <w:left w:val="nil"/>
+          <w:bottom w:val="nil"/>
+          <w:right w:val="nil"/>
+          <w:between w:val="nil"/>
+        </w:pBdr>
+        <w:jc w:val="both"/>
+      </w:pPr>
+      <w:r>
+        <w:t xml:space="preserve">Ajuts estatals per a PIMES innovadores (I+D i digitalització), Programa NEOTEC. El CDTI (Centro para el </w:t>
+      </w:r>
+      <w:proofErr w:type="spellStart"/>
+      <w:r>
+        <w:t>Desarrollo</w:t>
+      </w:r>
+      <w:proofErr w:type="spellEnd"/>
+      <w:r>
+        <w:t xml:space="preserve"> </w:t>
+      </w:r>
+      <w:proofErr w:type="spellStart"/>
+      <w:r>
+        <w:t>Tecnológico</w:t>
+      </w:r>
+      <w:proofErr w:type="spellEnd"/>
+      <w:r>
+        <w:t xml:space="preserve"> y la </w:t>
+      </w:r>
+      <w:proofErr w:type="spellStart"/>
+      <w:r>
+        <w:t>Innovación</w:t>
+      </w:r>
+      <w:proofErr w:type="spellEnd"/>
+      <w:r>
+        <w:t>) és l’organisme que canalitza totes les sol·licituds de finançament públic per a projectes d’I+D de les empreses espanyoles.</w:t>
+      </w:r>
+    </w:p>
+    <w:p>
+      <w:pPr>
+        <w:pBdr>
+          <w:top w:val="nil"/>
+          <w:left w:val="nil"/>
+          <w:bottom w:val="nil"/>
+          <w:right w:val="nil"/>
+          <w:between w:val="nil"/>
+        </w:pBdr>
+        <w:ind w:left="1440"/>
+        <w:jc w:val="both"/>
+      </w:pPr>
+      <w:r>
+        <w:t>El programa NEOTEC és l’ajut estatal més important per a noves empreses innovadores. Font: Llistat d’ajuts estatals per a PIMES 2025</w:t>
+      </w:r>
+    </w:p>
+    <w:p>
+      <w:pPr>
+        <w:spacing w:before="240" w:after="240"/>
+        <w:ind w:left="1440"/>
+        <w:jc w:val="both"/>
+      </w:pPr>
+      <w:r>
+        <w:t>El seu objectiu és finançar la creació i consolidació d’empreses de base tecnològica que té activitat de R+D pròpia.</w:t>
+      </w:r>
+    </w:p>
+    <w:p>
+      <w:pPr>
+        <w:spacing w:before="240" w:after="240"/>
+        <w:ind w:left="1440"/>
+        <w:jc w:val="both"/>
+      </w:pPr>
+      <w:r>
+        <w:t>Segons el CDTI, una empresa de base tecnològica és aquella que:</w:t>
+      </w:r>
+    </w:p>
+    <w:p>
+      <w:pPr>
+        <w:numPr>
+          <w:ilvl w:val="0"/>
+          <w:numId w:val="18"/>
+        </w:numPr>
+        <w:spacing w:before="240" w:after="0"/>
+      </w:pPr>
+      <w:r>
+        <w:t>Basa el seu negoci en tecnologia pròpia</w:t>
+      </w:r>
+    </w:p>
+    <w:p>
+      <w:pPr>
+        <w:numPr>
+          <w:ilvl w:val="0"/>
+          <w:numId w:val="18"/>
+        </w:numPr>
+        <w:spacing w:after="0"/>
+      </w:pPr>
+      <w:r>
+        <w:t>Té activitat d’R+D interna</w:t>
+      </w:r>
+    </w:p>
+    <w:p>
+      <w:pPr>
+        <w:numPr>
+          <w:ilvl w:val="0"/>
+          <w:numId w:val="18"/>
+        </w:numPr>
+        <w:spacing w:after="240"/>
+      </w:pPr>
+      <w:r>
+        <w:t>Utilitza coneixement científic o tècnic com a avantatge competitiu</w:t>
+      </w:r>
+    </w:p>
+    <w:p>
+      <w:pPr>
+        <w:spacing w:before="240" w:after="240"/>
+        <w:ind w:left="720" w:firstLine="720"/>
+        <w:jc w:val="both"/>
+      </w:pPr>
+      <w:r>
+        <w:t>Segons la convocatòria oficial 2025 del CDTI i el BOE:</w:t>
+      </w:r>
+    </w:p>
+    <w:p>
+      <w:pPr>
+        <w:numPr>
+          <w:ilvl w:val="0"/>
+          <w:numId w:val="19"/>
+        </w:numPr>
+        <w:spacing w:before="240" w:after="0"/>
+      </w:pPr>
+      <w:r>
+        <w:t>Subvenció a fons perdut</w:t>
+      </w:r>
+    </w:p>
+    <w:p>
+      <w:pPr>
+        <w:numPr>
+          <w:ilvl w:val="0"/>
+          <w:numId w:val="19"/>
+        </w:numPr>
+        <w:spacing w:after="0"/>
+      </w:pPr>
+      <w:r>
+        <w:t>Fins al 70% del pressupost elegible</w:t>
+      </w:r>
+    </w:p>
+    <w:p>
+      <w:pPr>
+        <w:numPr>
+          <w:ilvl w:val="0"/>
+          <w:numId w:val="19"/>
+        </w:numPr>
+        <w:spacing w:after="240"/>
+      </w:pPr>
+      <w:r>
+        <w:t>Fins al 85% si incorporeu un doctor al projecte</w:t>
+      </w:r>
+    </w:p>
+    <w:p>
+      <w:pPr>
+        <w:pBdr>
+          <w:top w:val="nil"/>
+          <w:left w:val="nil"/>
+          <w:bottom w:val="nil"/>
+          <w:right w:val="nil"/>
+          <w:between w:val="nil"/>
+        </w:pBdr>
+        <w:spacing w:before="240" w:after="240"/>
+        <w:ind w:left="1440"/>
+        <w:jc w:val="both"/>
+      </w:pPr>
+      <w:r>
+        <w:t>Segons el CDTI i el BOE, NEOTEC finança les següents despeses:</w:t>
+      </w:r>
+    </w:p>
+    <w:p>
+      <w:pPr>
+        <w:numPr>
+          <w:ilvl w:val="0"/>
+          <w:numId w:val="20"/>
+        </w:numPr>
+        <w:pBdr>
+          <w:top w:val="nil"/>
+          <w:left w:val="nil"/>
+          <w:bottom w:val="nil"/>
+          <w:right w:val="nil"/>
+          <w:between w:val="nil"/>
+        </w:pBdr>
+        <w:spacing w:before="240" w:after="0"/>
+        <w:jc w:val="both"/>
+      </w:pPr>
+      <w:r>
+        <w:t>Personal propi dedicat a R+D</w:t>
+      </w:r>
+    </w:p>
+    <w:p>
+      <w:pPr>
+        <w:numPr>
+          <w:ilvl w:val="0"/>
+          <w:numId w:val="20"/>
+        </w:numPr>
+        <w:pBdr>
+          <w:top w:val="nil"/>
+          <w:left w:val="nil"/>
+          <w:bottom w:val="nil"/>
+          <w:right w:val="nil"/>
+          <w:between w:val="nil"/>
+        </w:pBdr>
+        <w:spacing w:after="0"/>
+        <w:jc w:val="both"/>
+      </w:pPr>
+      <w:r>
+        <w:t>Contractació de personal altament qualificat</w:t>
+      </w:r>
+    </w:p>
+    <w:p>
+      <w:pPr>
+        <w:numPr>
+          <w:ilvl w:val="0"/>
+          <w:numId w:val="20"/>
+        </w:numPr>
+        <w:pBdr>
+          <w:top w:val="nil"/>
+          <w:left w:val="nil"/>
+          <w:bottom w:val="nil"/>
+          <w:right w:val="nil"/>
+          <w:between w:val="nil"/>
+        </w:pBdr>
+        <w:spacing w:after="0"/>
+        <w:jc w:val="both"/>
+      </w:pPr>
+      <w:r>
+        <w:t>Desenvolupament tecnològic</w:t>
+      </w:r>
+    </w:p>
+    <w:p>
+      <w:pPr>
+        <w:numPr>
+          <w:ilvl w:val="0"/>
+          <w:numId w:val="20"/>
+        </w:numPr>
+        <w:pBdr>
+          <w:top w:val="nil"/>
+          <w:left w:val="nil"/>
+          <w:bottom w:val="nil"/>
+          <w:right w:val="nil"/>
+          <w:between w:val="nil"/>
+        </w:pBdr>
+        <w:spacing w:after="0"/>
+        <w:jc w:val="both"/>
+      </w:pPr>
+      <w:r>
+        <w:t>Prototipatge i proves</w:t>
+      </w:r>
+    </w:p>
+    <w:p>
+      <w:pPr>
+        <w:numPr>
+          <w:ilvl w:val="0"/>
+          <w:numId w:val="20"/>
+        </w:numPr>
+        <w:pBdr>
+          <w:top w:val="nil"/>
+          <w:left w:val="nil"/>
+          <w:bottom w:val="nil"/>
+          <w:right w:val="nil"/>
+          <w:between w:val="nil"/>
+        </w:pBdr>
+        <w:spacing w:after="0"/>
+        <w:jc w:val="both"/>
+      </w:pPr>
+      <w:r>
+        <w:t>Enginyeria i industrialització inicial</w:t>
+      </w:r>
+    </w:p>
+    <w:p>
+      <w:pPr>
+        <w:numPr>
+          <w:ilvl w:val="0"/>
+          <w:numId w:val="20"/>
+        </w:numPr>
+        <w:pBdr>
+          <w:top w:val="nil"/>
+          <w:left w:val="nil"/>
+          <w:bottom w:val="nil"/>
+          <w:right w:val="nil"/>
+          <w:between w:val="nil"/>
+        </w:pBdr>
+        <w:spacing w:after="0"/>
+        <w:jc w:val="both"/>
+      </w:pPr>
+      <w:r>
+        <w:t>Serveis externs tecnològics</w:t>
+      </w:r>
+    </w:p>
+    <w:p>
+      <w:pPr>
+        <w:numPr>
+          <w:ilvl w:val="0"/>
+          <w:numId w:val="20"/>
+        </w:numPr>
+        <w:pBdr>
+          <w:top w:val="nil"/>
+          <w:left w:val="nil"/>
+          <w:bottom w:val="nil"/>
+          <w:right w:val="nil"/>
+          <w:between w:val="nil"/>
+        </w:pBdr>
+        <w:spacing w:after="240"/>
+        <w:jc w:val="both"/>
+      </w:pPr>
+      <w:r>
+        <w:t xml:space="preserve">Equipament i maquinària vinculada al projecte </w:t>
+      </w:r>
+    </w:p>
+    <w:p>
+      <w:pPr>
+        <w:pBdr>
+          <w:top w:val="nil"/>
+          <w:left w:val="nil"/>
+          <w:bottom w:val="nil"/>
+          <w:right w:val="nil"/>
+          <w:between w:val="nil"/>
+        </w:pBdr>
+        <w:spacing w:before="240" w:after="240"/>
+        <w:ind w:left="1440"/>
+        <w:jc w:val="both"/>
+      </w:pPr>
+      <w:r>
+        <w:lastRenderedPageBreak/>
+        <w:t>I els requisits principals son:</w:t>
+      </w:r>
+    </w:p>
+    <w:p>
+      <w:pPr>
+        <w:numPr>
+          <w:ilvl w:val="0"/>
+          <w:numId w:val="21"/>
+        </w:numPr>
+        <w:pBdr>
+          <w:top w:val="nil"/>
+          <w:left w:val="nil"/>
+          <w:bottom w:val="nil"/>
+          <w:right w:val="nil"/>
+          <w:between w:val="nil"/>
+        </w:pBdr>
+        <w:spacing w:before="240" w:after="0"/>
+        <w:jc w:val="both"/>
+      </w:pPr>
+      <w:r>
+        <w:t>Ser una petita empresa</w:t>
+      </w:r>
+    </w:p>
+    <w:p>
+      <w:pPr>
+        <w:numPr>
+          <w:ilvl w:val="0"/>
+          <w:numId w:val="21"/>
+        </w:numPr>
+        <w:pBdr>
+          <w:top w:val="nil"/>
+          <w:left w:val="nil"/>
+          <w:bottom w:val="nil"/>
+          <w:right w:val="nil"/>
+          <w:between w:val="nil"/>
+        </w:pBdr>
+        <w:spacing w:after="0"/>
+        <w:jc w:val="both"/>
+      </w:pPr>
+      <w:r>
+        <w:t>Amb menys de 3 anys d’antiguitat</w:t>
+      </w:r>
+    </w:p>
+    <w:p>
+      <w:pPr>
+        <w:numPr>
+          <w:ilvl w:val="0"/>
+          <w:numId w:val="21"/>
+        </w:numPr>
+        <w:pBdr>
+          <w:top w:val="nil"/>
+          <w:left w:val="nil"/>
+          <w:bottom w:val="nil"/>
+          <w:right w:val="nil"/>
+          <w:between w:val="nil"/>
+        </w:pBdr>
+        <w:spacing w:after="0"/>
+        <w:jc w:val="both"/>
+      </w:pPr>
+      <w:r>
+        <w:t>Capital social mínim: 20.000 €</w:t>
+      </w:r>
+    </w:p>
+    <w:p>
+      <w:pPr>
+        <w:numPr>
+          <w:ilvl w:val="0"/>
+          <w:numId w:val="21"/>
+        </w:numPr>
+        <w:pBdr>
+          <w:top w:val="nil"/>
+          <w:left w:val="nil"/>
+          <w:bottom w:val="nil"/>
+          <w:right w:val="nil"/>
+          <w:between w:val="nil"/>
+        </w:pBdr>
+        <w:spacing w:after="240"/>
+        <w:jc w:val="both"/>
+      </w:pPr>
+      <w:r>
+        <w:t xml:space="preserve">Model de negoci basat en </w:t>
+      </w:r>
+      <w:proofErr w:type="spellStart"/>
+      <w:r>
+        <w:t>tecnología</w:t>
+      </w:r>
+      <w:proofErr w:type="spellEnd"/>
+      <w:r>
+        <w:t xml:space="preserve"> pròpia</w:t>
+      </w:r>
+    </w:p>
+    <w:p>
+      <w:pPr>
+        <w:ind w:left="1440"/>
+        <w:jc w:val="both"/>
+      </w:pPr>
+      <w:r>
+        <w:t>La nostra empresa encaixa ja que desenvolupem una màquina amb un projecte d’R+D aplicada, amb tecnologia pròpia i amb un avantatge competitiu. I som una petita empresa.</w:t>
+      </w:r>
+    </w:p>
+    <w:p>
+      <w:pPr>
+        <w:ind w:left="1440"/>
+        <w:jc w:val="both"/>
+      </w:pPr>
+      <w:r>
+        <w:t>Passos a seguir per optar aquesta subvenció a l’Annex II</w:t>
+      </w:r>
+    </w:p>
+    <w:p>
+      <w:pPr>
+        <w:ind w:left="720"/>
+        <w:jc w:val="both"/>
+      </w:pPr>
+    </w:p>
+    <w:p>
+      <w:pPr>
+        <w:numPr>
+          <w:ilvl w:val="0"/>
+          <w:numId w:val="15"/>
+        </w:numPr>
+        <w:jc w:val="both"/>
+        <w:rPr>
+          <w:b/>
+          <w:bCs/>
+        </w:rPr>
+      </w:pPr>
+      <w:r>
+        <w:rPr>
+          <w:b/>
+          <w:bCs/>
+        </w:rPr>
+        <w:t xml:space="preserve">Factors econòmics: </w:t>
+      </w:r>
+      <w:r>
+        <w:t xml:space="preserve">Tornant al nivell turístic, cal tenir en compte que aquest continua essent essencial per a la comunitat de Girona. Representa aproximadament el 20% del PIB de Girona, i genera llocs de treball directe. A més, que indirectament fomenta el desenvolupament de serveis, comerços, restauració i infraestructures locals. </w:t>
+      </w:r>
+    </w:p>
+    <w:p>
+      <w:pPr>
+        <w:ind w:left="720"/>
+        <w:jc w:val="both"/>
+      </w:pPr>
+      <w:r>
+        <w:t xml:space="preserve">Cal tenir en compte que a Catalunya hi han més de 49.000 establiments de menjar i beure. Segons </w:t>
+      </w:r>
+      <w:proofErr w:type="spellStart"/>
+      <w:r>
+        <w:t>Idescat</w:t>
+      </w:r>
+      <w:proofErr w:type="spellEnd"/>
+      <w:r>
+        <w:t xml:space="preserve">, indiquem gràfica de xifres de negocis </w:t>
+      </w:r>
+      <w:proofErr w:type="spellStart"/>
+      <w:r>
+        <w:t>d’hosteleria</w:t>
+      </w:r>
+      <w:proofErr w:type="spellEnd"/>
+      <w:r>
+        <w:t xml:space="preserve"> i el seu recorregut del 2016 al 2023: </w:t>
+      </w:r>
+    </w:p>
+    <w:p>
+      <w:pPr>
+        <w:ind w:left="720"/>
+        <w:jc w:val="both"/>
+      </w:pPr>
+      <w:r>
+        <w:rPr>
+          <w:noProof/>
+        </w:rPr>
+        <w:drawing>
+          <wp:inline distT="114300" distB="114300" distL="114300" distR="114300" wp14:anchorId="4BA9AAD4" wp14:editId="470B6B7F">
+            <wp:extent cx="4808541" cy="3419792"/>
+            <wp:effectExtent l="0" t="0" r="0" b="0"/>
+            <wp:docPr id="50012" name="image5.png"/>
+            <wp:cNvGraphicFramePr/>
+            <a:graphic xmlns:a="http://schemas.openxmlformats.org/drawingml/2006/main">
+              <a:graphicData uri="http://schemas.openxmlformats.org/drawingml/2006/picture">
+                <pic:pic xmlns:pic="http://schemas.openxmlformats.org/drawingml/2006/picture">
+                  <pic:nvPicPr>
+                    <pic:cNvPr id="7" name="image5.png"/>
+                    <pic:cNvPicPr preferRelativeResize="0"/>
+                  </pic:nvPicPr>
+                  <pic:blipFill>
+                    <a:blip r:embed="rId15"/>
+                    <a:srcRect/>
+                    <a:stretch>
+                      <a:fillRect/>
+                    </a:stretch>
+                  </pic:blipFill>
+                  <pic:spPr>
+                    <a:xfrm>
+                      <a:off x="0" y="0"/>
+                      <a:ext cx="4808541" cy="3419792"/>
+                    </a:xfrm>
+                    <a:prstGeom prst="rect">
+                      <a:avLst/>
+                    </a:prstGeom>
+                    <a:ln/>
+                  </pic:spPr>
+                </pic:pic>
+              </a:graphicData>
+            </a:graphic>
+          </wp:inline>
+        </w:drawing>
+      </w:r>
+    </w:p>
+    <w:p>
+      <w:pPr>
+        <w:ind w:left="708"/>
+        <w:jc w:val="both"/>
+      </w:pPr>
+      <w:r>
+        <w:lastRenderedPageBreak/>
+        <w:tab/>
+        <w:t xml:space="preserve">Clarament és un sector que en quant a xifres, sobretot pel que fa a destinats a la restauració, cafeteries, </w:t>
+      </w:r>
+      <w:proofErr w:type="spellStart"/>
+      <w:r>
+        <w:t>etc</w:t>
+      </w:r>
+      <w:proofErr w:type="spellEnd"/>
+      <w:r>
+        <w:t xml:space="preserve"> les xifres van a l’alça any </w:t>
+      </w:r>
+      <w:proofErr w:type="spellStart"/>
+      <w:r>
+        <w:t>rera</w:t>
+      </w:r>
+      <w:proofErr w:type="spellEnd"/>
+      <w:r>
+        <w:t xml:space="preserve"> any (traient el 2020 ja que es va veure afectat pel </w:t>
+      </w:r>
+      <w:proofErr w:type="spellStart"/>
+      <w:r>
+        <w:t>Covid</w:t>
+      </w:r>
+      <w:proofErr w:type="spellEnd"/>
+      <w:r>
+        <w:t xml:space="preserve">). </w:t>
+      </w:r>
+    </w:p>
+    <w:p>
+      <w:pPr>
+        <w:ind w:left="708"/>
+        <w:jc w:val="both"/>
+      </w:pPr>
+      <w:r>
+        <w:t xml:space="preserve">Tenint en compte aquests volums, l’oportunitat d'introduir PIMPAN al sector, cal potenciar-la per donar eficiència a aquests establiments. Doncs és una oportunitat directa per a aquest tipus de maquinaria; ja que de cares a l’establiment serà una forma d’estalvi de temps i costos. </w:t>
+      </w:r>
+    </w:p>
+    <w:p>
+      <w:pPr>
+        <w:ind w:left="708"/>
+        <w:jc w:val="both"/>
+      </w:pPr>
+      <w:r>
+        <w:t xml:space="preserve">Tot i que serà necessari tenir en compte el tipus de clients; doncs hi hauran establiments que siguin més sensibles al preu; com per exemple els establiments petits. </w:t>
+      </w:r>
+    </w:p>
+    <w:p>
+      <w:pPr>
+        <w:ind w:left="708"/>
+        <w:jc w:val="both"/>
+      </w:pPr>
+    </w:p>
+    <w:p>
+      <w:pPr>
+        <w:numPr>
+          <w:ilvl w:val="0"/>
+          <w:numId w:val="15"/>
+        </w:numPr>
+        <w:jc w:val="both"/>
+        <w:rPr>
+          <w:b/>
+          <w:bCs/>
+        </w:rPr>
+      </w:pPr>
+      <w:r>
+        <w:rPr>
+          <w:b/>
+          <w:bCs/>
+        </w:rPr>
+        <w:t xml:space="preserve">Factors </w:t>
+      </w:r>
+      <w:proofErr w:type="spellStart"/>
+      <w:r>
+        <w:rPr>
+          <w:b/>
+          <w:bCs/>
+        </w:rPr>
+        <w:t>socio</w:t>
+      </w:r>
+      <w:proofErr w:type="spellEnd"/>
+      <w:r>
+        <w:rPr>
+          <w:b/>
+          <w:bCs/>
+        </w:rPr>
+        <w:t xml:space="preserve">-demogràfics: </w:t>
+      </w:r>
+      <w:r>
+        <w:t xml:space="preserve">A nivell </w:t>
+      </w:r>
+      <w:proofErr w:type="spellStart"/>
+      <w:r>
+        <w:t>Socio</w:t>
+      </w:r>
+      <w:proofErr w:type="spellEnd"/>
+      <w:r>
+        <w:t xml:space="preserve">-demogràfic; Girona rep al voltant de 8,5 milions de turistes a l’any. A part, hi ha hagut un creixement en quant a consum fora de casa. A més, el consumidor es mostra més exigent: Busca qualitat i rapidesa. </w:t>
+      </w:r>
+    </w:p>
+    <w:p>
+      <w:pPr>
+        <w:ind w:left="720"/>
+        <w:jc w:val="both"/>
+      </w:pPr>
+      <w:r>
+        <w:t xml:space="preserve">També cal tenir en compte que el mercat té més cura de la seva dieta; busquen més productes artesanals, saludables, etc. </w:t>
+      </w:r>
+    </w:p>
+    <w:p>
+      <w:pPr>
+        <w:ind w:left="720"/>
+        <w:jc w:val="both"/>
+      </w:pPr>
+      <w:r>
+        <w:t xml:space="preserve">En quant al tipus de client que trobem que pot ser més potencial, sobretot pot ser tant tipus bars, fleques on sobretot venen entrepans a gent que treballa. Els seus clients finals tenen edat d’entre 30-50 anys i busquen rapidesa i </w:t>
+      </w:r>
+      <w:proofErr w:type="spellStart"/>
+      <w:r>
+        <w:t>conveninencia</w:t>
+      </w:r>
+      <w:proofErr w:type="spellEnd"/>
+      <w:r>
+        <w:t xml:space="preserve">. A més, tenen un consum repetitiu (diari o setmanal); que a diferència de l’entorn turístic, és un consum més freqüent i el </w:t>
+      </w:r>
+      <w:proofErr w:type="spellStart"/>
+      <w:r>
+        <w:t>ticket</w:t>
+      </w:r>
+      <w:proofErr w:type="spellEnd"/>
+      <w:r>
+        <w:t xml:space="preserve"> mig és menor. A part, i el que més interessa a PIMPAN és que tenen més fidelitzat a aquest tipus de local, ja que són més propers (Com pot ser un Bar Àngel situat a Fornells de la Selva). </w:t>
+      </w:r>
+    </w:p>
+    <w:p>
+      <w:pPr>
+        <w:ind w:left="720"/>
+        <w:jc w:val="both"/>
+        <w:rPr>
+          <w:i/>
+          <w:iCs/>
+        </w:rPr>
+      </w:pPr>
+      <w:r>
+        <w:t>Segons un article de “</w:t>
+      </w:r>
+      <w:proofErr w:type="spellStart"/>
+      <w:r>
+        <w:t>Forbes</w:t>
+      </w:r>
+      <w:proofErr w:type="spellEnd"/>
+      <w:r>
+        <w:t xml:space="preserve"> España” recull el següent: “</w:t>
+      </w:r>
+      <w:r>
+        <w:rPr>
+          <w:rFonts w:ascii="Georgia" w:eastAsia="Georgia" w:hAnsi="Georgia" w:cs="Georgia"/>
+          <w:i/>
+          <w:iCs/>
+          <w:highlight w:val="white"/>
+        </w:rPr>
+        <w:t xml:space="preserve">Respecto a la </w:t>
+      </w:r>
+      <w:proofErr w:type="spellStart"/>
+      <w:r>
+        <w:rPr>
+          <w:rFonts w:ascii="Georgia" w:eastAsia="Georgia" w:hAnsi="Georgia" w:cs="Georgia"/>
+          <w:i/>
+          <w:iCs/>
+          <w:highlight w:val="white"/>
+        </w:rPr>
+        <w:t>diversificación</w:t>
+      </w:r>
+      <w:proofErr w:type="spellEnd"/>
+      <w:r>
+        <w:rPr>
+          <w:rFonts w:ascii="Georgia" w:eastAsia="Georgia" w:hAnsi="Georgia" w:cs="Georgia"/>
+          <w:i/>
+          <w:iCs/>
+          <w:highlight w:val="white"/>
+        </w:rPr>
+        <w:t xml:space="preserve"> de las ocasiones de consumo, el estudio evidencia que, de </w:t>
+      </w:r>
+      <w:proofErr w:type="spellStart"/>
+      <w:r>
+        <w:rPr>
+          <w:rFonts w:ascii="Georgia" w:eastAsia="Georgia" w:hAnsi="Georgia" w:cs="Georgia"/>
+          <w:i/>
+          <w:iCs/>
+          <w:highlight w:val="white"/>
+        </w:rPr>
+        <w:t>lunes</w:t>
+      </w:r>
+      <w:proofErr w:type="spellEnd"/>
+      <w:r>
+        <w:rPr>
+          <w:rFonts w:ascii="Georgia" w:eastAsia="Georgia" w:hAnsi="Georgia" w:cs="Georgia"/>
+          <w:i/>
+          <w:iCs/>
+          <w:highlight w:val="white"/>
+        </w:rPr>
+        <w:t xml:space="preserve"> a </w:t>
+      </w:r>
+      <w:proofErr w:type="spellStart"/>
+      <w:r>
+        <w:rPr>
+          <w:rFonts w:ascii="Georgia" w:eastAsia="Georgia" w:hAnsi="Georgia" w:cs="Georgia"/>
+          <w:i/>
+          <w:iCs/>
+          <w:highlight w:val="white"/>
+        </w:rPr>
+        <w:t>viernes</w:t>
+      </w:r>
+      <w:proofErr w:type="spellEnd"/>
+      <w:r>
+        <w:rPr>
+          <w:rFonts w:ascii="Georgia" w:eastAsia="Georgia" w:hAnsi="Georgia" w:cs="Georgia"/>
+          <w:i/>
+          <w:iCs/>
+          <w:highlight w:val="white"/>
+        </w:rPr>
+        <w:t xml:space="preserve">, </w:t>
+      </w:r>
+      <w:proofErr w:type="spellStart"/>
+      <w:r>
+        <w:rPr>
+          <w:rFonts w:ascii="Georgia" w:eastAsia="Georgia" w:hAnsi="Georgia" w:cs="Georgia"/>
+          <w:i/>
+          <w:iCs/>
+          <w:highlight w:val="white"/>
+        </w:rPr>
+        <w:t>coincidiendo</w:t>
+      </w:r>
+      <w:proofErr w:type="spellEnd"/>
+      <w:r>
+        <w:rPr>
+          <w:rFonts w:ascii="Georgia" w:eastAsia="Georgia" w:hAnsi="Georgia" w:cs="Georgia"/>
+          <w:i/>
+          <w:iCs/>
+          <w:highlight w:val="white"/>
+        </w:rPr>
+        <w:t xml:space="preserve"> </w:t>
+      </w:r>
+      <w:proofErr w:type="spellStart"/>
+      <w:r>
+        <w:rPr>
+          <w:rFonts w:ascii="Georgia" w:eastAsia="Georgia" w:hAnsi="Georgia" w:cs="Georgia"/>
+          <w:i/>
+          <w:iCs/>
+          <w:highlight w:val="white"/>
+        </w:rPr>
+        <w:t>mayoritariamente</w:t>
+      </w:r>
+      <w:proofErr w:type="spellEnd"/>
+      <w:r>
+        <w:rPr>
+          <w:rFonts w:ascii="Georgia" w:eastAsia="Georgia" w:hAnsi="Georgia" w:cs="Georgia"/>
+          <w:i/>
+          <w:iCs/>
+          <w:highlight w:val="white"/>
+        </w:rPr>
+        <w:t xml:space="preserve"> con la jornada laboral, el 74% de los consumidores </w:t>
+      </w:r>
+      <w:proofErr w:type="spellStart"/>
+      <w:r>
+        <w:rPr>
+          <w:rFonts w:ascii="Georgia" w:eastAsia="Georgia" w:hAnsi="Georgia" w:cs="Georgia"/>
+          <w:i/>
+          <w:iCs/>
+          <w:highlight w:val="white"/>
+        </w:rPr>
+        <w:t>realiza</w:t>
+      </w:r>
+      <w:proofErr w:type="spellEnd"/>
+      <w:r>
+        <w:rPr>
+          <w:rFonts w:ascii="Georgia" w:eastAsia="Georgia" w:hAnsi="Georgia" w:cs="Georgia"/>
+          <w:i/>
+          <w:iCs/>
+          <w:highlight w:val="white"/>
+        </w:rPr>
+        <w:t xml:space="preserve"> un </w:t>
+      </w:r>
+      <w:proofErr w:type="spellStart"/>
+      <w:r>
+        <w:rPr>
+          <w:rFonts w:ascii="Georgia" w:eastAsia="Georgia" w:hAnsi="Georgia" w:cs="Georgia"/>
+          <w:i/>
+          <w:iCs/>
+          <w:highlight w:val="white"/>
+        </w:rPr>
+        <w:t>desayuno</w:t>
+      </w:r>
+      <w:proofErr w:type="spellEnd"/>
+      <w:r>
+        <w:rPr>
+          <w:rFonts w:ascii="Georgia" w:eastAsia="Georgia" w:hAnsi="Georgia" w:cs="Georgia"/>
+          <w:i/>
+          <w:iCs/>
+          <w:highlight w:val="white"/>
+        </w:rPr>
+        <w:t xml:space="preserve"> a </w:t>
+      </w:r>
+      <w:proofErr w:type="spellStart"/>
+      <w:r>
+        <w:rPr>
+          <w:rFonts w:ascii="Georgia" w:eastAsia="Georgia" w:hAnsi="Georgia" w:cs="Georgia"/>
+          <w:i/>
+          <w:iCs/>
+          <w:highlight w:val="white"/>
+        </w:rPr>
+        <w:t>media</w:t>
+      </w:r>
+      <w:proofErr w:type="spellEnd"/>
+      <w:r>
+        <w:rPr>
+          <w:rFonts w:ascii="Georgia" w:eastAsia="Georgia" w:hAnsi="Georgia" w:cs="Georgia"/>
+          <w:i/>
+          <w:iCs/>
+          <w:highlight w:val="white"/>
+        </w:rPr>
+        <w:t xml:space="preserve"> </w:t>
+      </w:r>
+      <w:proofErr w:type="spellStart"/>
+      <w:r>
+        <w:rPr>
+          <w:rFonts w:ascii="Georgia" w:eastAsia="Georgia" w:hAnsi="Georgia" w:cs="Georgia"/>
+          <w:i/>
+          <w:iCs/>
+          <w:highlight w:val="white"/>
+        </w:rPr>
+        <w:t>mañana</w:t>
+      </w:r>
+      <w:proofErr w:type="spellEnd"/>
+      <w:r>
+        <w:rPr>
+          <w:rFonts w:ascii="Georgia" w:eastAsia="Georgia" w:hAnsi="Georgia" w:cs="Georgia"/>
+          <w:i/>
+          <w:iCs/>
+          <w:highlight w:val="white"/>
+        </w:rPr>
+        <w:t xml:space="preserve">, un </w:t>
+      </w:r>
+      <w:proofErr w:type="spellStart"/>
+      <w:r>
+        <w:rPr>
+          <w:rFonts w:ascii="Georgia" w:eastAsia="Georgia" w:hAnsi="Georgia" w:cs="Georgia"/>
+          <w:i/>
+          <w:iCs/>
+          <w:highlight w:val="white"/>
+        </w:rPr>
+        <w:t>momento</w:t>
+      </w:r>
+      <w:proofErr w:type="spellEnd"/>
+      <w:r>
+        <w:rPr>
+          <w:rFonts w:ascii="Georgia" w:eastAsia="Georgia" w:hAnsi="Georgia" w:cs="Georgia"/>
+          <w:i/>
+          <w:iCs/>
+          <w:highlight w:val="white"/>
+        </w:rPr>
+        <w:t xml:space="preserve"> que </w:t>
+      </w:r>
+      <w:proofErr w:type="spellStart"/>
+      <w:r>
+        <w:rPr>
+          <w:rFonts w:ascii="Georgia" w:eastAsia="Georgia" w:hAnsi="Georgia" w:cs="Georgia"/>
+          <w:i/>
+          <w:iCs/>
+          <w:highlight w:val="white"/>
+        </w:rPr>
+        <w:t>también</w:t>
+      </w:r>
+      <w:proofErr w:type="spellEnd"/>
+      <w:r>
+        <w:rPr>
+          <w:rFonts w:ascii="Georgia" w:eastAsia="Georgia" w:hAnsi="Georgia" w:cs="Georgia"/>
+          <w:i/>
+          <w:iCs/>
+          <w:highlight w:val="white"/>
+        </w:rPr>
+        <w:t xml:space="preserve"> </w:t>
+      </w:r>
+      <w:proofErr w:type="spellStart"/>
+      <w:r>
+        <w:rPr>
+          <w:rFonts w:ascii="Georgia" w:eastAsia="Georgia" w:hAnsi="Georgia" w:cs="Georgia"/>
+          <w:i/>
+          <w:iCs/>
+          <w:highlight w:val="white"/>
+        </w:rPr>
+        <w:t>aprovecha</w:t>
+      </w:r>
+      <w:proofErr w:type="spellEnd"/>
+      <w:r>
+        <w:rPr>
+          <w:rFonts w:ascii="Georgia" w:eastAsia="Georgia" w:hAnsi="Georgia" w:cs="Georgia"/>
+          <w:i/>
+          <w:iCs/>
+          <w:highlight w:val="white"/>
+        </w:rPr>
+        <w:t xml:space="preserve"> el 83% de los </w:t>
+      </w:r>
+      <w:proofErr w:type="spellStart"/>
+      <w:r>
+        <w:rPr>
+          <w:rFonts w:ascii="Georgia" w:eastAsia="Georgia" w:hAnsi="Georgia" w:cs="Georgia"/>
+          <w:i/>
+          <w:iCs/>
+          <w:highlight w:val="white"/>
+        </w:rPr>
+        <w:t>trabajadores</w:t>
+      </w:r>
+      <w:proofErr w:type="spellEnd"/>
+      <w:r>
+        <w:rPr>
+          <w:rFonts w:ascii="Georgia" w:eastAsia="Georgia" w:hAnsi="Georgia" w:cs="Georgia"/>
+          <w:i/>
+          <w:iCs/>
+          <w:highlight w:val="white"/>
+        </w:rPr>
+        <w:t xml:space="preserve"> para </w:t>
+      </w:r>
+      <w:proofErr w:type="spellStart"/>
+      <w:r>
+        <w:rPr>
+          <w:rFonts w:ascii="Georgia" w:eastAsia="Georgia" w:hAnsi="Georgia" w:cs="Georgia"/>
+          <w:i/>
+          <w:iCs/>
+          <w:highlight w:val="white"/>
+        </w:rPr>
+        <w:t>socializar</w:t>
+      </w:r>
+      <w:proofErr w:type="spellEnd"/>
+      <w:r>
+        <w:rPr>
+          <w:rFonts w:ascii="Georgia" w:eastAsia="Georgia" w:hAnsi="Georgia" w:cs="Georgia"/>
+          <w:i/>
+          <w:iCs/>
+          <w:highlight w:val="white"/>
+        </w:rPr>
+        <w:t xml:space="preserve"> o </w:t>
+      </w:r>
+      <w:proofErr w:type="spellStart"/>
+      <w:r>
+        <w:rPr>
+          <w:rFonts w:ascii="Georgia" w:eastAsia="Georgia" w:hAnsi="Georgia" w:cs="Georgia"/>
+          <w:i/>
+          <w:iCs/>
+          <w:highlight w:val="white"/>
+        </w:rPr>
+        <w:t>simplemente</w:t>
+      </w:r>
+      <w:proofErr w:type="spellEnd"/>
+      <w:r>
+        <w:rPr>
+          <w:rFonts w:ascii="Georgia" w:eastAsia="Georgia" w:hAnsi="Georgia" w:cs="Georgia"/>
+          <w:i/>
+          <w:iCs/>
+          <w:highlight w:val="white"/>
+        </w:rPr>
+        <w:t xml:space="preserve"> para </w:t>
+      </w:r>
+      <w:proofErr w:type="spellStart"/>
+      <w:r>
+        <w:rPr>
+          <w:rFonts w:ascii="Georgia" w:eastAsia="Georgia" w:hAnsi="Georgia" w:cs="Georgia"/>
+          <w:i/>
+          <w:iCs/>
+          <w:highlight w:val="white"/>
+        </w:rPr>
+        <w:t>ahorrar</w:t>
+      </w:r>
+      <w:proofErr w:type="spellEnd"/>
+      <w:r>
+        <w:rPr>
+          <w:rFonts w:ascii="Georgia" w:eastAsia="Georgia" w:hAnsi="Georgia" w:cs="Georgia"/>
+          <w:i/>
+          <w:iCs/>
+          <w:highlight w:val="white"/>
+        </w:rPr>
+        <w:t xml:space="preserve"> </w:t>
+      </w:r>
+      <w:proofErr w:type="spellStart"/>
+      <w:r>
+        <w:rPr>
+          <w:rFonts w:ascii="Georgia" w:eastAsia="Georgia" w:hAnsi="Georgia" w:cs="Georgia"/>
+          <w:i/>
+          <w:iCs/>
+          <w:highlight w:val="white"/>
+        </w:rPr>
+        <w:t>tiempo</w:t>
+      </w:r>
+      <w:proofErr w:type="spellEnd"/>
+      <w:r>
+        <w:rPr>
+          <w:rFonts w:ascii="Georgia" w:eastAsia="Georgia" w:hAnsi="Georgia" w:cs="Georgia"/>
+          <w:i/>
+          <w:iCs/>
+          <w:highlight w:val="white"/>
+        </w:rPr>
+        <w:t>.</w:t>
+      </w:r>
+      <w:r>
+        <w:rPr>
+          <w:i/>
+          <w:iCs/>
+        </w:rPr>
+        <w:t xml:space="preserve"> “</w:t>
+      </w:r>
+    </w:p>
+    <w:p>
+      <w:pPr>
+        <w:ind w:left="720"/>
+        <w:jc w:val="both"/>
+      </w:pPr>
+    </w:p>
+    <w:p>
+      <w:pPr>
+        <w:numPr>
+          <w:ilvl w:val="0"/>
+          <w:numId w:val="15"/>
+        </w:numPr>
+        <w:jc w:val="both"/>
+        <w:rPr>
+          <w:b/>
+          <w:bCs/>
+        </w:rPr>
+      </w:pPr>
+      <w:r>
+        <w:rPr>
+          <w:b/>
+          <w:bCs/>
+        </w:rPr>
+        <w:t xml:space="preserve">Factors tecnològics: </w:t>
+      </w:r>
+      <w:r>
+        <w:t xml:space="preserve">Durant l’any 2025, molts locals s’han hagut de reinventar abraçant a la innovació, la sostenibilitat i la personalització,  més a mesura que avança la IA. La tecnologia ha passat de ser un complement a </w:t>
+      </w:r>
+      <w:r>
+        <w:lastRenderedPageBreak/>
+        <w:t xml:space="preserve">convertir-se en una necessitat essencial. Des de sistemes de reserves automatitzades, gestió amb els TPV, etc. </w:t>
+      </w:r>
+    </w:p>
+    <w:p>
+      <w:pPr>
+        <w:ind w:left="720"/>
+        <w:jc w:val="both"/>
+      </w:pPr>
+      <w:r>
+        <w:t xml:space="preserve">La idea és millorar la rendibilitat i la optimització. Aleshores, per a PIMPAN tenim alt potencial com a producte innovador tecnològic; ja que ens diferenciem en fer el tall horitzontal i la precisió que </w:t>
+      </w:r>
+      <w:proofErr w:type="spellStart"/>
+      <w:r>
+        <w:t>dóna</w:t>
+      </w:r>
+      <w:proofErr w:type="spellEnd"/>
+      <w:r>
+        <w:t xml:space="preserve">, la rapidesa i la facilitat d’ús i neteja. </w:t>
+      </w:r>
+    </w:p>
+    <w:p>
+      <w:pPr>
+        <w:ind w:left="720"/>
+        <w:jc w:val="both"/>
+      </w:pPr>
+    </w:p>
+    <w:p>
+      <w:pPr>
+        <w:numPr>
+          <w:ilvl w:val="0"/>
+          <w:numId w:val="15"/>
+        </w:numPr>
+        <w:jc w:val="both"/>
+        <w:rPr>
+          <w:b/>
+          <w:bCs/>
+        </w:rPr>
+      </w:pPr>
+      <w:r>
+        <w:rPr>
+          <w:b/>
+          <w:bCs/>
+        </w:rPr>
+        <w:t xml:space="preserve">Factors ecològics o mediambientals: </w:t>
+      </w:r>
+      <w:r>
+        <w:t xml:space="preserve">La Consciència ecològica cada cop és major i, el sector HORECA cal que estigui a l’alçada. L’eliminació de plàstics d’un sol ús, l’ús d’ingredients de proximitat i de temporada, o l’eficiència energètica estarà en el centre de les operacions diàries en el sector. </w:t>
+      </w:r>
+    </w:p>
+    <w:p>
+      <w:pPr>
+        <w:ind w:left="720"/>
+        <w:jc w:val="both"/>
+      </w:pPr>
+      <w:r>
+        <w:t xml:space="preserve">Per tant, caldrà tenir en compte la reducció de </w:t>
+      </w:r>
+      <w:proofErr w:type="spellStart"/>
+      <w:r>
+        <w:t>desperdicis</w:t>
+      </w:r>
+      <w:proofErr w:type="spellEnd"/>
+      <w:r>
+        <w:t xml:space="preserve"> de pa i també que la màquina consumeix menys energia. A part, que només pel simple fet d’utilitzar-la, puja la seguretat en quant accidents. Actualment la gran </w:t>
+      </w:r>
+      <w:proofErr w:type="spellStart"/>
+      <w:r>
+        <w:t>majoría</w:t>
+      </w:r>
+      <w:proofErr w:type="spellEnd"/>
+      <w:r>
+        <w:t xml:space="preserve"> d’establiments fan el tall manual i estan d’acord en que es </w:t>
+      </w:r>
+      <w:proofErr w:type="spellStart"/>
+      <w:r>
+        <w:t>correr</w:t>
+      </w:r>
+      <w:proofErr w:type="spellEnd"/>
+      <w:r>
+        <w:t xml:space="preserve"> risc que el personal es pugui fer mal. </w:t>
+      </w:r>
+    </w:p>
+    <w:p>
+      <w:pPr>
+        <w:ind w:left="720"/>
+        <w:jc w:val="both"/>
+      </w:pPr>
+    </w:p>
+    <w:p>
+      <w:pPr>
+        <w:numPr>
+          <w:ilvl w:val="0"/>
+          <w:numId w:val="15"/>
+        </w:numPr>
+        <w:jc w:val="both"/>
+        <w:rPr>
+          <w:b/>
+          <w:bCs/>
+        </w:rPr>
+      </w:pPr>
+      <w:r>
+        <w:rPr>
+          <w:b/>
+          <w:bCs/>
+        </w:rPr>
+        <w:t xml:space="preserve">Factors legals: </w:t>
+      </w:r>
+      <w:r>
+        <w:t xml:space="preserve">A nivell legal cal tenir en compte la </w:t>
+      </w:r>
+      <w:r>
+        <w:rPr>
+          <w:i/>
+          <w:iCs/>
+        </w:rPr>
+        <w:t xml:space="preserve">Llei 17/2011 de Seguretat Alimentaria (Espanya), </w:t>
+      </w:r>
+      <w:r>
+        <w:t xml:space="preserve">on bàsicament es recull que tot aquell equip que intervingui en aliments ha de garantir la seguretat del consumidor i per tant, exigeix en aquest cas, que hi hagi una traçabilitat correcte. La màquina de PIMPAN no pot ser una font de contaminació ni risc físic clarament. </w:t>
+      </w:r>
+    </w:p>
+    <w:p>
+      <w:pPr>
+        <w:ind w:left="720"/>
+        <w:jc w:val="both"/>
+      </w:pPr>
+      <w:r>
+        <w:t xml:space="preserve">També tenir en compte el </w:t>
+      </w:r>
+      <w:r>
+        <w:rPr>
+          <w:i/>
+          <w:iCs/>
+        </w:rPr>
+        <w:t xml:space="preserve">Reglament CE 852/2004 (UE) sobre higiene alimentaria. </w:t>
+      </w:r>
+      <w:r>
+        <w:t xml:space="preserve">aquest reglament obliga a que la maquinaria que tingui contacte amb aliments es pugui netejar amb facilitat. No pot transmetre agents contaminants. I és d’obligatorietat tenir-ho </w:t>
+      </w:r>
+      <w:proofErr w:type="spellStart"/>
+      <w:r>
+        <w:t>actio</w:t>
+      </w:r>
+      <w:proofErr w:type="spellEnd"/>
+      <w:r>
+        <w:t xml:space="preserve">; sense el </w:t>
+      </w:r>
+      <w:proofErr w:type="spellStart"/>
+      <w:r>
+        <w:t>el</w:t>
+      </w:r>
+      <w:proofErr w:type="spellEnd"/>
+      <w:r>
+        <w:t xml:space="preserve"> reglament CE no </w:t>
+      </w:r>
+      <w:proofErr w:type="spellStart"/>
+      <w:r>
+        <w:t>podriem</w:t>
+      </w:r>
+      <w:proofErr w:type="spellEnd"/>
+      <w:r>
+        <w:t xml:space="preserve"> comercialitzar la màquina de forma legal. </w:t>
+      </w:r>
+    </w:p>
+    <w:p>
+      <w:pPr>
+        <w:ind w:left="720"/>
+        <w:jc w:val="both"/>
+      </w:pPr>
+      <w:r>
+        <w:t xml:space="preserve">Per tant per a la nostres màquines PIMPAN que estarà en contacte amb aliments; caldrà que compleixi les normes d’higiene i de seguretat industrial. El fet que sigui d’acer ja el fa un material certificat per a la manipulació d’aliments. A més, serà fàcil de netejar i amb superfície llisa (no porosa on es pugui reservar agents contaminants). </w:t>
+      </w:r>
+    </w:p>
+    <w:p>
+      <w:pPr>
+        <w:ind w:left="720"/>
+        <w:jc w:val="both"/>
+      </w:pPr>
+      <w:r>
+        <w:t xml:space="preserve">De fet, pel simple fet d’utilitzar la màquina assegures més higiene que amb el tall manual. </w:t>
+      </w:r>
+    </w:p>
+    <w:p>
+      <w:pPr>
+        <w:ind w:left="720"/>
+        <w:jc w:val="both"/>
+      </w:pPr>
+      <w:r>
+        <w:lastRenderedPageBreak/>
+        <w:t xml:space="preserve">PIMPAN també </w:t>
+      </w:r>
+      <w:proofErr w:type="spellStart"/>
+      <w:r>
+        <w:t>facilitará</w:t>
+      </w:r>
+      <w:proofErr w:type="spellEnd"/>
+      <w:r>
+        <w:t xml:space="preserve"> un manual d’instruccions d’ús i de neteja per a que el client final dins el sector HORECA ho tingui sota control, ja que a molts establiments valoren aquesta seguretat. </w:t>
+      </w:r>
+    </w:p>
+    <w:p>
+      <w:pPr>
+        <w:ind w:left="720"/>
+        <w:jc w:val="both"/>
+      </w:pPr>
+    </w:p>
+    <w:p>
+      <w:pPr>
+        <w:ind w:left="720"/>
+        <w:jc w:val="both"/>
+        <w:rPr>
+          <w:b/>
+          <w:bCs/>
+          <w:u w:val="single"/>
+        </w:rPr>
+      </w:pPr>
+      <w:proofErr w:type="spellStart"/>
+      <w:r>
+        <w:rPr>
+          <w:b/>
+          <w:bCs/>
+          <w:u w:val="single"/>
+        </w:rPr>
+        <w:t>Análisis</w:t>
+      </w:r>
+      <w:proofErr w:type="spellEnd"/>
+      <w:r>
+        <w:rPr>
+          <w:b/>
+          <w:bCs/>
+          <w:u w:val="single"/>
+        </w:rPr>
+        <w:t xml:space="preserve"> </w:t>
+      </w:r>
+      <w:proofErr w:type="spellStart"/>
+      <w:r>
+        <w:rPr>
+          <w:b/>
+          <w:bCs/>
+          <w:u w:val="single"/>
+        </w:rPr>
+        <w:t>Pestel</w:t>
+      </w:r>
+      <w:proofErr w:type="spellEnd"/>
+      <w:r>
+        <w:rPr>
+          <w:b/>
+          <w:bCs/>
+          <w:u w:val="single"/>
+        </w:rPr>
+        <w:t xml:space="preserve">: </w:t>
+      </w:r>
+    </w:p>
+    <w:p>
+      <w:pPr>
+        <w:jc w:val="both"/>
+      </w:pPr>
+    </w:p>
+    <w:tbl>
+      <w:tblPr>
+        <w:tblStyle w:val="a1"/>
+        <w:tblpPr w:leftFromText="180" w:rightFromText="180" w:topFromText="180" w:bottomFromText="180" w:vertAnchor="text" w:tblpX="-50"/>
+        <w:tblW w:w="8505" w:type="dxa"/>
+        <w:tblInd w:w="0" w:type="dxa"/>
+        <w:tblBorders>
+          <w:top w:val="nil"/>
+          <w:left w:val="nil"/>
+          <w:bottom w:val="nil"/>
+          <w:right w:val="nil"/>
+          <w:insideH w:val="nil"/>
+          <w:insideV w:val="nil"/>
+        </w:tblBorders>
+        <w:tblLayout w:type="fixed"/>
+        <w:tblLook w:val="0600" w:firstRow="0" w:lastRow="0" w:firstColumn="0" w:lastColumn="0" w:noHBand="1" w:noVBand="1"/>
+      </w:tblPr>
+      <w:tblGrid>
+        <w:gridCol w:w="2040"/>
+        <w:gridCol w:w="2985"/>
+        <w:gridCol w:w="3480"/>
+      </w:tblGrid>
+      <w:tr>
+        <w:trPr>
+          <w:trHeight w:val="927"/>
+        </w:trPr>
+        <w:tc>
+          <w:tcPr>
+            <w:tcW w:w="2040" w:type="dxa"/>
+            <w:tcBorders>
+              <w:top w:val="single" w:sz="4" w:space="0" w:color="E6E6E6"/>
+              <w:left w:val="single" w:sz="4" w:space="0" w:color="E6E6E6"/>
+              <w:bottom w:val="single" w:sz="4" w:space="0" w:color="E6E6E6"/>
+              <w:right w:val="single" w:sz="4" w:space="0" w:color="E6E6E6"/>
+            </w:tcBorders>
+          </w:tcPr>
+          <w:p>
+            <w:pPr>
+              <w:ind w:left="720"/>
+              <w:jc w:val="both"/>
+              <w:rPr>
+                <w:sz w:val="21"/>
+                <w:szCs w:val="21"/>
+              </w:rPr>
+            </w:pPr>
+            <w:r>
+              <w:rPr>
+                <w:b/>
+                <w:bCs/>
+                <w:sz w:val="21"/>
+                <w:szCs w:val="21"/>
+              </w:rPr>
+              <w:lastRenderedPageBreak/>
+              <w:t>Factor</w:t>
+            </w:r>
+          </w:p>
+        </w:tc>
+        <w:tc>
+          <w:tcPr>
+            <w:tcW w:w="2985" w:type="dxa"/>
+            <w:tcBorders>
+              <w:top w:val="single" w:sz="4" w:space="0" w:color="E6E6E6"/>
+              <w:left w:val="single" w:sz="4" w:space="0" w:color="E6E6E6"/>
+              <w:bottom w:val="single" w:sz="4" w:space="0" w:color="E6E6E6"/>
+              <w:right w:val="single" w:sz="4" w:space="0" w:color="E6E6E6"/>
+            </w:tcBorders>
+          </w:tcPr>
+          <w:p>
+            <w:pPr>
+              <w:ind w:left="720"/>
+              <w:rPr>
+                <w:sz w:val="21"/>
+                <w:szCs w:val="21"/>
+              </w:rPr>
+            </w:pPr>
+            <w:r>
+              <w:rPr>
+                <w:b/>
+                <w:bCs/>
+                <w:sz w:val="21"/>
+                <w:szCs w:val="21"/>
+              </w:rPr>
+              <w:t>Aspectes identificats</w:t>
+            </w:r>
+          </w:p>
+        </w:tc>
+        <w:tc>
+          <w:tcPr>
+            <w:tcW w:w="3480" w:type="dxa"/>
+            <w:tcBorders>
+              <w:top w:val="single" w:sz="4" w:space="0" w:color="E6E6E6"/>
+              <w:left w:val="single" w:sz="4" w:space="0" w:color="E6E6E6"/>
+              <w:bottom w:val="single" w:sz="4" w:space="0" w:color="E6E6E6"/>
+              <w:right w:val="single" w:sz="4" w:space="0" w:color="E6E6E6"/>
+            </w:tcBorders>
+          </w:tcPr>
+          <w:p>
+            <w:pPr>
+              <w:ind w:left="720"/>
+              <w:rPr>
+                <w:sz w:val="21"/>
+                <w:szCs w:val="21"/>
+              </w:rPr>
+            </w:pPr>
+            <w:r>
+              <w:rPr>
+                <w:b/>
+                <w:bCs/>
+                <w:sz w:val="21"/>
+                <w:szCs w:val="21"/>
+              </w:rPr>
+              <w:t>Impacte per a PIMPAN</w:t>
+            </w:r>
+          </w:p>
+        </w:tc>
+      </w:tr>
+      <w:tr>
+        <w:trPr>
+          <w:trHeight w:val="1764"/>
+        </w:trPr>
+        <w:tc>
+          <w:tcPr>
+            <w:tcW w:w="2040" w:type="dxa"/>
+            <w:tcBorders>
+              <w:top w:val="single" w:sz="4" w:space="0" w:color="E6E6E6"/>
+              <w:left w:val="single" w:sz="4" w:space="0" w:color="E6E6E6"/>
+              <w:bottom w:val="single" w:sz="4" w:space="0" w:color="E6E6E6"/>
+              <w:right w:val="single" w:sz="4" w:space="0" w:color="E6E6E6"/>
+            </w:tcBorders>
+          </w:tcPr>
+          <w:p>
+            <w:pPr>
+              <w:jc w:val="both"/>
+              <w:rPr>
+                <w:b/>
+                <w:bCs/>
+                <w:sz w:val="21"/>
+                <w:szCs w:val="21"/>
+              </w:rPr>
+            </w:pPr>
+          </w:p>
+          <w:p>
+            <w:pPr>
+              <w:jc w:val="both"/>
+              <w:rPr>
+                <w:sz w:val="21"/>
+                <w:szCs w:val="21"/>
+              </w:rPr>
+            </w:pPr>
+            <w:r>
+              <w:rPr>
+                <w:b/>
+                <w:bCs/>
+                <w:sz w:val="21"/>
+                <w:szCs w:val="21"/>
+              </w:rPr>
+              <w:t>Polític</w:t>
+            </w:r>
+          </w:p>
+        </w:tc>
+        <w:tc>
+          <w:tcPr>
+            <w:tcW w:w="2985" w:type="dxa"/>
+            <w:tcBorders>
+              <w:top w:val="single" w:sz="4" w:space="0" w:color="E6E6E6"/>
+              <w:left w:val="single" w:sz="4" w:space="0" w:color="E6E6E6"/>
+              <w:bottom w:val="single" w:sz="4" w:space="0" w:color="E6E6E6"/>
+              <w:right w:val="single" w:sz="4" w:space="0" w:color="E6E6E6"/>
+            </w:tcBorders>
+          </w:tcPr>
+          <w:p>
+            <w:pPr>
+              <w:rPr>
+                <w:sz w:val="21"/>
+                <w:szCs w:val="21"/>
+              </w:rPr>
+            </w:pPr>
+            <w:r>
+              <w:rPr>
+                <w:sz w:val="21"/>
+                <w:szCs w:val="21"/>
+              </w:rPr>
+              <w:t>Suport institucional al turisme i a l'hostaleria. Existència de subvencions d'ACCIÓ i programes NEOTEC per a innovació i R+D.</w:t>
+            </w:r>
+          </w:p>
+        </w:tc>
+        <w:tc>
+          <w:tcPr>
+            <w:tcW w:w="3480" w:type="dxa"/>
+            <w:tcBorders>
+              <w:top w:val="single" w:sz="4" w:space="0" w:color="E6E6E6"/>
+              <w:left w:val="single" w:sz="4" w:space="0" w:color="E6E6E6"/>
+              <w:bottom w:val="single" w:sz="4" w:space="0" w:color="E6E6E6"/>
+              <w:right w:val="single" w:sz="4" w:space="0" w:color="E6E6E6"/>
+            </w:tcBorders>
+          </w:tcPr>
+          <w:p>
+            <w:pPr>
+              <w:rPr>
+                <w:sz w:val="21"/>
+                <w:szCs w:val="21"/>
+              </w:rPr>
+            </w:pPr>
+            <w:r>
+              <w:rPr>
+                <w:b/>
+                <w:bCs/>
+                <w:sz w:val="21"/>
+                <w:szCs w:val="21"/>
+              </w:rPr>
+              <w:t>Positiu</w:t>
+            </w:r>
+            <w:r>
+              <w:rPr>
+                <w:sz w:val="21"/>
+                <w:szCs w:val="21"/>
+              </w:rPr>
+              <w:t>. Facilita el finançament del desenvolupament, prototipatge i industrialització del producte.</w:t>
+            </w:r>
+            <w:hyperlink r:id="rId16">
+              <w:r>
+                <w:rPr>
+                  <w:sz w:val="21"/>
+                  <w:szCs w:val="21"/>
+                </w:rPr>
+                <w:t xml:space="preserve"> </w:t>
+              </w:r>
+            </w:hyperlink>
+          </w:p>
+        </w:tc>
+      </w:tr>
+      <w:tr>
+        <w:trPr>
+          <w:trHeight w:val="2043"/>
+        </w:trPr>
+        <w:tc>
+          <w:tcPr>
+            <w:tcW w:w="2040" w:type="dxa"/>
+            <w:tcBorders>
+              <w:top w:val="single" w:sz="4" w:space="0" w:color="E6E6E6"/>
+              <w:left w:val="single" w:sz="4" w:space="0" w:color="E6E6E6"/>
+              <w:bottom w:val="single" w:sz="4" w:space="0" w:color="E6E6E6"/>
+              <w:right w:val="single" w:sz="4" w:space="0" w:color="E6E6E6"/>
+            </w:tcBorders>
+          </w:tcPr>
+          <w:p>
+            <w:pPr>
+              <w:jc w:val="both"/>
+              <w:rPr>
+                <w:b/>
+                <w:bCs/>
+                <w:sz w:val="21"/>
+                <w:szCs w:val="21"/>
+              </w:rPr>
+            </w:pPr>
+          </w:p>
+          <w:p>
+            <w:pPr>
+              <w:jc w:val="both"/>
+              <w:rPr>
+                <w:sz w:val="21"/>
+                <w:szCs w:val="21"/>
+              </w:rPr>
+            </w:pPr>
+            <w:r>
+              <w:rPr>
+                <w:b/>
+                <w:bCs/>
+                <w:sz w:val="21"/>
+                <w:szCs w:val="21"/>
+              </w:rPr>
+              <w:t>Econòmic</w:t>
+            </w:r>
+          </w:p>
+        </w:tc>
+        <w:tc>
+          <w:tcPr>
+            <w:tcW w:w="2985" w:type="dxa"/>
+            <w:tcBorders>
+              <w:top w:val="single" w:sz="4" w:space="0" w:color="E6E6E6"/>
+              <w:left w:val="single" w:sz="4" w:space="0" w:color="E6E6E6"/>
+              <w:bottom w:val="single" w:sz="4" w:space="0" w:color="E6E6E6"/>
+              <w:right w:val="single" w:sz="4" w:space="0" w:color="E6E6E6"/>
+            </w:tcBorders>
+          </w:tcPr>
+          <w:p>
+            <w:pPr>
+              <w:rPr>
+                <w:sz w:val="21"/>
+                <w:szCs w:val="21"/>
+              </w:rPr>
+            </w:pPr>
+            <w:r>
+              <w:rPr>
+                <w:sz w:val="21"/>
+                <w:szCs w:val="21"/>
+              </w:rPr>
+              <w:t>Creixement sostingut del sector HORECA, més de 49.000 establiments de restauració a Catalunya i necessitat de millorar la productivitat.</w:t>
+            </w:r>
+          </w:p>
+        </w:tc>
+        <w:tc>
+          <w:tcPr>
+            <w:tcW w:w="3480" w:type="dxa"/>
+            <w:tcBorders>
+              <w:top w:val="single" w:sz="4" w:space="0" w:color="E6E6E6"/>
+              <w:left w:val="single" w:sz="4" w:space="0" w:color="E6E6E6"/>
+              <w:bottom w:val="single" w:sz="4" w:space="0" w:color="E6E6E6"/>
+              <w:right w:val="single" w:sz="4" w:space="0" w:color="E6E6E6"/>
+            </w:tcBorders>
+          </w:tcPr>
+          <w:p>
+            <w:pPr>
+              <w:rPr>
+                <w:sz w:val="21"/>
+                <w:szCs w:val="21"/>
+              </w:rPr>
+            </w:pPr>
+            <w:r>
+              <w:rPr>
+                <w:b/>
+                <w:bCs/>
+                <w:sz w:val="21"/>
+                <w:szCs w:val="21"/>
+              </w:rPr>
+              <w:t>Positiu</w:t>
+            </w:r>
+            <w:r>
+              <w:rPr>
+                <w:sz w:val="21"/>
+                <w:szCs w:val="21"/>
+              </w:rPr>
+              <w:t>. Hi ha una base de mercat gran i amb necessitat d'optimitzar temps i costos.</w:t>
+            </w:r>
+            <w:hyperlink r:id="rId16">
+              <w:r>
+                <w:rPr>
+                  <w:sz w:val="21"/>
+                  <w:szCs w:val="21"/>
+                </w:rPr>
+                <w:t xml:space="preserve"> </w:t>
+              </w:r>
+            </w:hyperlink>
+          </w:p>
+        </w:tc>
+      </w:tr>
+      <w:tr>
+        <w:trPr>
+          <w:trHeight w:val="1485"/>
+        </w:trPr>
+        <w:tc>
+          <w:tcPr>
+            <w:tcW w:w="2040" w:type="dxa"/>
+            <w:tcBorders>
+              <w:top w:val="single" w:sz="4" w:space="0" w:color="E6E6E6"/>
+              <w:left w:val="single" w:sz="4" w:space="0" w:color="E6E6E6"/>
+              <w:bottom w:val="single" w:sz="4" w:space="0" w:color="E6E6E6"/>
+              <w:right w:val="single" w:sz="4" w:space="0" w:color="E6E6E6"/>
+            </w:tcBorders>
+          </w:tcPr>
+          <w:p>
+            <w:pPr>
+              <w:jc w:val="both"/>
+              <w:rPr>
+                <w:b/>
+                <w:bCs/>
+                <w:sz w:val="21"/>
+                <w:szCs w:val="21"/>
+              </w:rPr>
+            </w:pPr>
+          </w:p>
+          <w:p>
+            <w:pPr>
+              <w:jc w:val="both"/>
+              <w:rPr>
+                <w:sz w:val="21"/>
+                <w:szCs w:val="21"/>
+              </w:rPr>
+            </w:pPr>
+            <w:r>
+              <w:rPr>
+                <w:b/>
+                <w:bCs/>
+                <w:sz w:val="21"/>
+                <w:szCs w:val="21"/>
+              </w:rPr>
+              <w:t>Sociodemogràfic</w:t>
+            </w:r>
+          </w:p>
+        </w:tc>
+        <w:tc>
+          <w:tcPr>
+            <w:tcW w:w="2985" w:type="dxa"/>
+            <w:tcBorders>
+              <w:top w:val="single" w:sz="4" w:space="0" w:color="E6E6E6"/>
+              <w:left w:val="single" w:sz="4" w:space="0" w:color="E6E6E6"/>
+              <w:bottom w:val="single" w:sz="4" w:space="0" w:color="E6E6E6"/>
+              <w:right w:val="single" w:sz="4" w:space="0" w:color="E6E6E6"/>
+            </w:tcBorders>
+          </w:tcPr>
+          <w:p>
+            <w:pPr>
+              <w:rPr>
+                <w:sz w:val="21"/>
+                <w:szCs w:val="21"/>
+              </w:rPr>
+            </w:pPr>
+            <w:r>
+              <w:rPr>
+                <w:sz w:val="21"/>
+                <w:szCs w:val="21"/>
+              </w:rPr>
+              <w:t>Increment del consum fora de casa, alta activitat turística a Girona i consumidors que exigeixen rapidesa i qualitat.</w:t>
+            </w:r>
+          </w:p>
+        </w:tc>
+        <w:tc>
+          <w:tcPr>
+            <w:tcW w:w="3480" w:type="dxa"/>
+            <w:tcBorders>
+              <w:top w:val="single" w:sz="4" w:space="0" w:color="E6E6E6"/>
+              <w:left w:val="single" w:sz="4" w:space="0" w:color="E6E6E6"/>
+              <w:bottom w:val="single" w:sz="4" w:space="0" w:color="E6E6E6"/>
+              <w:right w:val="single" w:sz="4" w:space="0" w:color="E6E6E6"/>
+            </w:tcBorders>
+          </w:tcPr>
+          <w:p>
+            <w:pPr>
+              <w:rPr>
+                <w:sz w:val="21"/>
+                <w:szCs w:val="21"/>
+              </w:rPr>
+            </w:pPr>
+            <w:r>
+              <w:rPr>
+                <w:b/>
+                <w:bCs/>
+                <w:sz w:val="21"/>
+                <w:szCs w:val="21"/>
+              </w:rPr>
+              <w:t>Positiu</w:t>
+            </w:r>
+            <w:r>
+              <w:rPr>
+                <w:sz w:val="21"/>
+                <w:szCs w:val="21"/>
+              </w:rPr>
+              <w:t>. Els establiments necessiten servir més entrepans amb rapidesa i uniformitat.</w:t>
+            </w:r>
+            <w:hyperlink r:id="rId16">
+              <w:r>
+                <w:rPr>
+                  <w:sz w:val="21"/>
+                  <w:szCs w:val="21"/>
+                </w:rPr>
+                <w:t xml:space="preserve"> </w:t>
+              </w:r>
+            </w:hyperlink>
+          </w:p>
+        </w:tc>
+      </w:tr>
+      <w:tr>
+        <w:trPr>
+          <w:trHeight w:val="1485"/>
+        </w:trPr>
+        <w:tc>
+          <w:tcPr>
+            <w:tcW w:w="2040" w:type="dxa"/>
+            <w:tcBorders>
+              <w:top w:val="single" w:sz="4" w:space="0" w:color="E6E6E6"/>
+              <w:left w:val="single" w:sz="4" w:space="0" w:color="E6E6E6"/>
+              <w:bottom w:val="single" w:sz="4" w:space="0" w:color="E6E6E6"/>
+              <w:right w:val="single" w:sz="4" w:space="0" w:color="E6E6E6"/>
+            </w:tcBorders>
+          </w:tcPr>
+          <w:p>
+            <w:pPr>
+              <w:jc w:val="both"/>
+              <w:rPr>
+                <w:b/>
+                <w:bCs/>
+                <w:sz w:val="21"/>
+                <w:szCs w:val="21"/>
+              </w:rPr>
+            </w:pPr>
+          </w:p>
+          <w:p>
+            <w:pPr>
+              <w:jc w:val="both"/>
+              <w:rPr>
+                <w:sz w:val="21"/>
+                <w:szCs w:val="21"/>
+              </w:rPr>
+            </w:pPr>
+            <w:r>
+              <w:rPr>
+                <w:b/>
+                <w:bCs/>
+                <w:sz w:val="21"/>
+                <w:szCs w:val="21"/>
+              </w:rPr>
+              <w:t>Tecnològic</w:t>
+            </w:r>
+          </w:p>
+        </w:tc>
+        <w:tc>
+          <w:tcPr>
+            <w:tcW w:w="2985" w:type="dxa"/>
+            <w:tcBorders>
+              <w:top w:val="single" w:sz="4" w:space="0" w:color="E6E6E6"/>
+              <w:left w:val="single" w:sz="4" w:space="0" w:color="E6E6E6"/>
+              <w:bottom w:val="single" w:sz="4" w:space="0" w:color="E6E6E6"/>
+              <w:right w:val="single" w:sz="4" w:space="0" w:color="E6E6E6"/>
+            </w:tcBorders>
+          </w:tcPr>
+          <w:p>
+            <w:pPr>
+              <w:rPr>
+                <w:sz w:val="21"/>
+                <w:szCs w:val="21"/>
+              </w:rPr>
+            </w:pPr>
+            <w:r>
+              <w:rPr>
+                <w:sz w:val="21"/>
+                <w:szCs w:val="21"/>
+              </w:rPr>
+              <w:t>Tendència a la digitalització i automatització dels negocis HORECA.</w:t>
+            </w:r>
+          </w:p>
+        </w:tc>
+        <w:tc>
+          <w:tcPr>
+            <w:tcW w:w="3480" w:type="dxa"/>
+            <w:tcBorders>
+              <w:top w:val="single" w:sz="4" w:space="0" w:color="E6E6E6"/>
+              <w:left w:val="single" w:sz="4" w:space="0" w:color="E6E6E6"/>
+              <w:bottom w:val="single" w:sz="4" w:space="0" w:color="E6E6E6"/>
+              <w:right w:val="single" w:sz="4" w:space="0" w:color="E6E6E6"/>
+            </w:tcBorders>
+          </w:tcPr>
+          <w:p>
+            <w:pPr>
+              <w:rPr>
+                <w:sz w:val="21"/>
+                <w:szCs w:val="21"/>
+              </w:rPr>
+            </w:pPr>
+            <w:r>
+              <w:rPr>
+                <w:b/>
+                <w:bCs/>
+                <w:sz w:val="21"/>
+                <w:szCs w:val="21"/>
+              </w:rPr>
+              <w:t>Molt positiu</w:t>
+            </w:r>
+            <w:r>
+              <w:rPr>
+                <w:sz w:val="21"/>
+                <w:szCs w:val="21"/>
+              </w:rPr>
+              <w:t>. La innovació de PIMPAN encaixa amb la cerca d'eines que millorin l'eficiència operativa.</w:t>
+            </w:r>
+            <w:hyperlink r:id="rId16">
+              <w:r>
+                <w:rPr>
+                  <w:sz w:val="21"/>
+                  <w:szCs w:val="21"/>
+                </w:rPr>
+                <w:t xml:space="preserve"> </w:t>
+              </w:r>
+            </w:hyperlink>
+          </w:p>
+        </w:tc>
+      </w:tr>
+      <w:tr>
+        <w:trPr>
+          <w:trHeight w:val="1764"/>
+        </w:trPr>
+        <w:tc>
+          <w:tcPr>
+            <w:tcW w:w="2040" w:type="dxa"/>
+            <w:tcBorders>
+              <w:top w:val="single" w:sz="4" w:space="0" w:color="E6E6E6"/>
+              <w:left w:val="single" w:sz="4" w:space="0" w:color="E6E6E6"/>
+              <w:bottom w:val="single" w:sz="4" w:space="0" w:color="E6E6E6"/>
+              <w:right w:val="single" w:sz="4" w:space="0" w:color="E6E6E6"/>
+            </w:tcBorders>
+          </w:tcPr>
+          <w:p>
+            <w:pPr>
+              <w:jc w:val="both"/>
+              <w:rPr>
+                <w:b/>
+                <w:bCs/>
+                <w:sz w:val="21"/>
+                <w:szCs w:val="21"/>
+              </w:rPr>
+            </w:pPr>
+          </w:p>
+          <w:p>
+            <w:pPr>
+              <w:jc w:val="both"/>
+              <w:rPr>
+                <w:sz w:val="21"/>
+                <w:szCs w:val="21"/>
+              </w:rPr>
+            </w:pPr>
+            <w:r>
+              <w:rPr>
+                <w:b/>
+                <w:bCs/>
+                <w:sz w:val="21"/>
+                <w:szCs w:val="21"/>
+              </w:rPr>
+              <w:t>Ecològic</w:t>
+            </w:r>
+          </w:p>
+        </w:tc>
+        <w:tc>
+          <w:tcPr>
+            <w:tcW w:w="2985" w:type="dxa"/>
+            <w:tcBorders>
+              <w:top w:val="single" w:sz="4" w:space="0" w:color="E6E6E6"/>
+              <w:left w:val="single" w:sz="4" w:space="0" w:color="E6E6E6"/>
+              <w:bottom w:val="single" w:sz="4" w:space="0" w:color="E6E6E6"/>
+              <w:right w:val="single" w:sz="4" w:space="0" w:color="E6E6E6"/>
+            </w:tcBorders>
+          </w:tcPr>
+          <w:p>
+            <w:pPr>
+              <w:rPr>
+                <w:sz w:val="21"/>
+                <w:szCs w:val="21"/>
+              </w:rPr>
+            </w:pPr>
+            <w:r>
+              <w:rPr>
+                <w:sz w:val="21"/>
+                <w:szCs w:val="21"/>
+              </w:rPr>
+              <w:t>Major sensibilitat ambiental, reducció del malbaratament alimentari i demanda d'equips eficients energèticament.</w:t>
+            </w:r>
+          </w:p>
+        </w:tc>
+        <w:tc>
+          <w:tcPr>
+            <w:tcW w:w="3480" w:type="dxa"/>
+            <w:tcBorders>
+              <w:top w:val="single" w:sz="4" w:space="0" w:color="E6E6E6"/>
+              <w:left w:val="single" w:sz="4" w:space="0" w:color="E6E6E6"/>
+              <w:bottom w:val="single" w:sz="4" w:space="0" w:color="E6E6E6"/>
+              <w:right w:val="single" w:sz="4" w:space="0" w:color="E6E6E6"/>
+            </w:tcBorders>
+          </w:tcPr>
+          <w:p>
+            <w:pPr>
+              <w:rPr>
+                <w:sz w:val="21"/>
+                <w:szCs w:val="21"/>
+              </w:rPr>
+            </w:pPr>
+            <w:r>
+              <w:rPr>
+                <w:b/>
+                <w:bCs/>
+                <w:sz w:val="21"/>
+                <w:szCs w:val="21"/>
+              </w:rPr>
+              <w:t>Positiu</w:t>
+            </w:r>
+            <w:r>
+              <w:rPr>
+                <w:sz w:val="21"/>
+                <w:szCs w:val="21"/>
+              </w:rPr>
+              <w:t>. PIMPAN redueix el desaprofitament de pa i contribueix a processos més eficients.</w:t>
+            </w:r>
+            <w:hyperlink r:id="rId16">
+              <w:r>
+                <w:rPr>
+                  <w:sz w:val="21"/>
+                  <w:szCs w:val="21"/>
+                </w:rPr>
+                <w:t xml:space="preserve"> </w:t>
+              </w:r>
+            </w:hyperlink>
+          </w:p>
+        </w:tc>
+      </w:tr>
+      <w:tr>
+        <w:trPr>
+          <w:trHeight w:val="1764"/>
+        </w:trPr>
+        <w:tc>
+          <w:tcPr>
+            <w:tcW w:w="2040" w:type="dxa"/>
+            <w:tcBorders>
+              <w:top w:val="single" w:sz="4" w:space="0" w:color="E6E6E6"/>
+              <w:left w:val="single" w:sz="4" w:space="0" w:color="E6E6E6"/>
+              <w:bottom w:val="single" w:sz="4" w:space="0" w:color="E6E6E6"/>
+              <w:right w:val="single" w:sz="4" w:space="0" w:color="E6E6E6"/>
+            </w:tcBorders>
+          </w:tcPr>
+          <w:p>
+            <w:pPr>
+              <w:jc w:val="both"/>
+              <w:rPr>
+                <w:b/>
+                <w:bCs/>
+                <w:sz w:val="21"/>
+                <w:szCs w:val="21"/>
+              </w:rPr>
+            </w:pPr>
+          </w:p>
+          <w:p>
+            <w:pPr>
+              <w:jc w:val="both"/>
+              <w:rPr>
+                <w:sz w:val="21"/>
+                <w:szCs w:val="21"/>
+              </w:rPr>
+            </w:pPr>
+            <w:r>
+              <w:rPr>
+                <w:b/>
+                <w:bCs/>
+                <w:sz w:val="21"/>
+                <w:szCs w:val="21"/>
+              </w:rPr>
+              <w:t>Legal</w:t>
+            </w:r>
+          </w:p>
+        </w:tc>
+        <w:tc>
+          <w:tcPr>
+            <w:tcW w:w="2985" w:type="dxa"/>
+            <w:tcBorders>
+              <w:top w:val="single" w:sz="4" w:space="0" w:color="E6E6E6"/>
+              <w:left w:val="single" w:sz="4" w:space="0" w:color="E6E6E6"/>
+              <w:bottom w:val="single" w:sz="4" w:space="0" w:color="E6E6E6"/>
+              <w:right w:val="single" w:sz="4" w:space="0" w:color="E6E6E6"/>
+            </w:tcBorders>
+          </w:tcPr>
+          <w:p>
+            <w:pPr>
+              <w:rPr>
+                <w:sz w:val="21"/>
+                <w:szCs w:val="21"/>
+              </w:rPr>
+            </w:pPr>
+            <w:r>
+              <w:rPr>
+                <w:sz w:val="21"/>
+                <w:szCs w:val="21"/>
+              </w:rPr>
+              <w:t>Normativa de seguretat alimentària, higiene i requisits CE per a maquinària que entra en contacte amb aliments.</w:t>
+            </w:r>
+          </w:p>
+        </w:tc>
+        <w:tc>
+          <w:tcPr>
+            <w:tcW w:w="3480" w:type="dxa"/>
+            <w:tcBorders>
+              <w:top w:val="single" w:sz="4" w:space="0" w:color="E6E6E6"/>
+              <w:left w:val="single" w:sz="4" w:space="0" w:color="E6E6E6"/>
+              <w:bottom w:val="single" w:sz="4" w:space="0" w:color="E6E6E6"/>
+              <w:right w:val="single" w:sz="4" w:space="0" w:color="E6E6E6"/>
+            </w:tcBorders>
+          </w:tcPr>
+          <w:p>
+            <w:pPr>
+              <w:rPr>
+                <w:sz w:val="21"/>
+                <w:szCs w:val="21"/>
+              </w:rPr>
+            </w:pPr>
+            <w:r>
+              <w:rPr>
+                <w:b/>
+                <w:bCs/>
+                <w:sz w:val="21"/>
+                <w:szCs w:val="21"/>
+              </w:rPr>
+              <w:t>Doble impacte</w:t>
+            </w:r>
+            <w:r>
+              <w:rPr>
+                <w:sz w:val="21"/>
+                <w:szCs w:val="21"/>
+              </w:rPr>
+              <w:t>: és una barrera d'entrada però també una oportunitat de diferenciació si el producte compleix totes les certificacions.</w:t>
+            </w:r>
+          </w:p>
+        </w:tc>
+      </w:tr>
+    </w:tbl>
+    <w:p>
+      <w:pPr>
+        <w:ind w:left="720"/>
+        <w:jc w:val="both"/>
+      </w:pPr>
+    </w:p>
+    <w:p>
+      <w:pPr>
+        <w:jc w:val="both"/>
+      </w:pPr>
+      <w:r>
+        <w:t xml:space="preserve">Diagnòstic: </w:t>
+      </w:r>
+    </w:p>
+    <w:p>
+      <w:pPr>
+        <w:jc w:val="both"/>
+      </w:pPr>
+      <w:r>
+        <w:t xml:space="preserve">L’atractiu del sector és alt i favorable per a l’entrada de PIMPAN. La baixa rivalitat competitiva i l’existència d’una necessitat real de millora operativa representen una oportunitat clara. Tanmateix, l’èxit no dependrà tant de superar altres fabricants, sinó de canviar els hàbits dels establiments </w:t>
+      </w:r>
+      <w:proofErr w:type="spellStart"/>
+      <w:r>
+        <w:t>HORECa</w:t>
+      </w:r>
+      <w:proofErr w:type="spellEnd"/>
+      <w:r>
+        <w:t xml:space="preserve"> i demostrar que abandonar el tall manual genera un estalvi econòmic i una millora de la seguretat suficients per justificar la inversió. </w:t>
+      </w:r>
+    </w:p>
+    <w:p>
+      <w:pPr>
+        <w:jc w:val="both"/>
+      </w:pPr>
+      <w:r>
+        <w:t xml:space="preserve">L’entorn general és molt favorable per a la introducció de PIMPAN. Els factors econòmics, socials i tecnològics impulsen la necessitat de solucions que augmentin la productivitat en el sector HORECA, mentre que els requisits legals constitueixen el principal repte, però també una barrera d’entrada que pot reforçar l’avantatge competitiu de l’empresa. </w:t>
+      </w:r>
+    </w:p>
+    <w:p>
+      <w:pPr>
+        <w:ind w:left="720"/>
+        <w:jc w:val="both"/>
+      </w:pPr>
+    </w:p>
+    <w:p>
+      <w:pPr>
+        <w:pStyle w:val="Heading3"/>
+        <w:jc w:val="both"/>
+        <w:rPr>
+          <w:rFonts w:ascii="Arial" w:eastAsia="Arial" w:hAnsi="Arial" w:cs="Arial"/>
+          <w:b/>
+          <w:bCs/>
+          <w:color w:val="000000"/>
+        </w:rPr>
+      </w:pPr>
       <w:r>
         <w:rPr>
           <w:rFonts w:ascii="Arial" w:eastAsia="Arial" w:hAnsi="Arial" w:cs="Arial"/>
@@ -9610,7 +12815,7 @@
           <wp:inline distT="114300" distB="114300" distL="114300" distR="114300" wp14:anchorId="1C27B0DE" wp14:editId="39B9044C">
             <wp:extent cx="5399730" cy="2451100"/>
             <wp:effectExtent l="0" t="0" r="0" b="0"/>
-            <wp:docPr id="8" name="image13.png" descr="Gráfico de respuestas de formularios. Título de la pregunta: Estaríeu disposats a invertir en una màquina específica per automatitzar aquest procés i reduir els temps de preparació?. Número de respuestas: 35 respuestas."/>
+            <wp:docPr id="50013" name="image13.png" descr="Gráfico de respuestas de formularios. Título de la pregunta: Estaríeu disposats a invertir en una màquina específica per automatitzar aquest procés i reduir els temps de preparació?. Número de respuestas: 35 respuestas."/>
             <wp:cNvGraphicFramePr/>
             <a:graphic xmlns:a="http://schemas.openxmlformats.org/drawingml/2006/main">
               <a:graphicData uri="http://schemas.openxmlformats.org/drawingml/2006/picture">
@@ -9664,7 +12869,7 @@
           <wp:inline distT="114300" distB="114300" distL="114300" distR="114300" wp14:anchorId="09E6B4AD" wp14:editId="72ADF4E3">
             <wp:extent cx="5399730" cy="2273300"/>
             <wp:effectExtent l="0" t="0" r="0" b="0"/>
-            <wp:docPr id="9" name="image3.png" descr="Gráfico de respuestas de formularios. Título de la pregunta: Quin rang de preu consideraries acceptable per a una maquinària d'aquestes característiques?. Número de respuestas: 35 respuestas."/>
+            <wp:docPr id="50014" name="image3.png" descr="Gráfico de respuestas de formularios. Título de la pregunta: Quin rang de preu consideraries acceptable per a una maquinària d'aquestes característiques?. Número de respuestas: 35 respuestas."/>
             <wp:cNvGraphicFramePr/>
             <a:graphic xmlns:a="http://schemas.openxmlformats.org/drawingml/2006/main">
               <a:graphicData uri="http://schemas.openxmlformats.org/drawingml/2006/picture">
@@ -9832,8 +13037,6 @@
           <w:color w:val="000000"/>
         </w:rPr>
       </w:pPr>
-      <w:bookmarkStart w:id="27" w:name="_heading=h.iw73y1wmjq08" w:colFirst="0" w:colLast="0"/>
-      <w:bookmarkEnd w:id="27"/>
       <w:r>
         <w:rPr>
           <w:rFonts w:ascii="Arial" w:eastAsia="Arial" w:hAnsi="Arial" w:cs="Arial"/>
@@ -9940,8 +13143,6 @@
           <w:color w:val="000000"/>
         </w:rPr>
       </w:pPr>
-      <w:bookmarkStart w:id="28" w:name="_heading=h.wpmrx3r9209u" w:colFirst="0" w:colLast="0"/>
-      <w:bookmarkEnd w:id="28"/>
       <w:r>
         <w:rPr>
           <w:rFonts w:ascii="Arial" w:eastAsia="Arial" w:hAnsi="Arial" w:cs="Arial"/>
@@ -10119,7 +13320,7 @@
           <wp:inline distT="114300" distB="114300" distL="114300" distR="114300" wp14:anchorId="16989078" wp14:editId="75EB0390">
             <wp:extent cx="5399730" cy="596900"/>
             <wp:effectExtent l="0" t="0" r="0" b="0"/>
-            <wp:docPr id="10" name="image10.png"/>
+            <wp:docPr id="50015" name="image10.png"/>
             <wp:cNvGraphicFramePr/>
             <a:graphic xmlns:a="http://schemas.openxmlformats.org/drawingml/2006/main">
               <a:graphicData uri="http://schemas.openxmlformats.org/drawingml/2006/picture">
@@ -10306,7 +13507,7 @@
             <wp:extent cx="5911803" cy="3930775"/>
             <wp:effectExtent l="0" t="0" r="0" b="0"/>
             <wp:wrapNone/>
-            <wp:docPr id="11" name="image19.png"/>
+            <wp:docPr id="50016" name="image19.png"/>
             <wp:cNvGraphicFramePr/>
             <a:graphic xmlns:a="http://schemas.openxmlformats.org/drawingml/2006/main">
               <a:graphicData uri="http://schemas.openxmlformats.org/drawingml/2006/picture">
@@ -10395,8 +13596,6 @@
           <w:color w:val="000000"/>
         </w:rPr>
       </w:pPr>
-      <w:bookmarkStart w:id="29" w:name="_heading=h.22he2mluzjsp" w:colFirst="0" w:colLast="0"/>
-      <w:bookmarkEnd w:id="29"/>
       <w:r>
         <w:br/>
       </w:r>
@@ -10575,8 +13774,6 @@
           <w:color w:val="000000"/>
         </w:rPr>
       </w:pPr>
-      <w:bookmarkStart w:id="30" w:name="_heading=h.9jqupuso2ixz" w:colFirst="0" w:colLast="0"/>
-      <w:bookmarkEnd w:id="30"/>
       <w:r>
         <w:rPr>
           <w:rFonts w:ascii="Arial" w:eastAsia="Arial" w:hAnsi="Arial" w:cs="Arial"/>
@@ -10804,8 +14001,242 @@
           <w:szCs w:val="32"/>
         </w:rPr>
       </w:pPr>
-      <w:bookmarkStart w:id="32" w:name="_heading=h.jwyi5tnhc2a" w:colFirst="0" w:colLast="0"/>
-      <w:bookmarkEnd w:id="32"/>
+      <w:r>
+        <w:rPr>
+          <w:rFonts w:ascii="Arial" w:eastAsia="Arial" w:hAnsi="Arial" w:cs="Arial"/>
+          <w:b/>
+          <w:bCs/>
+          <w:color w:val="000000"/>
+          <w:sz w:val="36"/>
+          <w:szCs w:val="36"/>
+        </w:rPr>
+        <w:t>DAFO i Matriu d’impacte</w:t>
+      </w:r>
+    </w:p>
+    <w:p>
+      <w:pPr>
+        <w:jc w:val="both"/>
+      </w:pPr>
+    </w:p>
+    <w:p>
+      <w:pPr>
+        <w:jc w:val="both"/>
+      </w:pPr>
+      <w:r>
+        <w:t xml:space="preserve">Per tal de poder confeccionar el DAFO, cal dir que ens hem basat sobretot en l’anàlisi extern ja que a nivell intern no podem fer un diagnòstic com a tal, ja que es tracta d’un producte innovador. Tot i així, amb la informació del punt 2 d’aquest Pla de Màrqueting, podem elaborar un DAFO provisional del que </w:t>
+      </w:r>
+      <w:proofErr w:type="spellStart"/>
+      <w:r>
+        <w:t>podría</w:t>
+      </w:r>
+      <w:proofErr w:type="spellEnd"/>
+      <w:r>
+        <w:t xml:space="preserve"> ser: </w:t>
+      </w:r>
+    </w:p>
+    <w:p>
+      <w:pPr>
+        <w:jc w:val="center"/>
+      </w:pPr>
+      <w:r>
+        <w:rPr>
+          <w:noProof/>
+        </w:rPr>
+        <w:lastRenderedPageBreak/>
+        <w:drawing>
+          <wp:inline distT="114300" distB="114300" distL="114300" distR="114300" wp14:anchorId="14C3131F" wp14:editId="1AC14489">
+            <wp:extent cx="4516275" cy="4516275"/>
+            <wp:effectExtent l="0" t="0" r="0" b="0"/>
+            <wp:docPr id="50017" name="image18.png"/>
+            <wp:cNvGraphicFramePr/>
+            <a:graphic xmlns:a="http://schemas.openxmlformats.org/drawingml/2006/main">
+              <a:graphicData uri="http://schemas.openxmlformats.org/drawingml/2006/picture">
+                <pic:pic xmlns:pic="http://schemas.openxmlformats.org/drawingml/2006/picture">
+                  <pic:nvPicPr>
+                    <pic:cNvPr id="12" name="image18.png"/>
+                    <pic:cNvPicPr preferRelativeResize="0"/>
+                  </pic:nvPicPr>
+                  <pic:blipFill>
+                    <a:blip r:embed="rId21"/>
+                    <a:srcRect/>
+                    <a:stretch>
+                      <a:fillRect/>
+                    </a:stretch>
+                  </pic:blipFill>
+                  <pic:spPr>
+                    <a:xfrm>
+                      <a:off x="0" y="0"/>
+                      <a:ext cx="4516275" cy="4516275"/>
+                    </a:xfrm>
+                    <a:prstGeom prst="rect">
+                      <a:avLst/>
+                    </a:prstGeom>
+                    <a:ln/>
+                  </pic:spPr>
+                </pic:pic>
+              </a:graphicData>
+            </a:graphic>
+          </wp:inline>
+        </w:drawing>
+      </w:r>
+    </w:p>
+    <w:p>
+      <w:pPr>
+        <w:jc w:val="both"/>
+      </w:pPr>
+      <w:r>
+        <w:t xml:space="preserve">Per tant, el projecte es presenta amb una alta oportunitat de mercat però amb una barrera clau; que és que el consumidor final descobreixi la necessitat de la màquina i deixi el ganivet (tall manual). Doncs PIMPAN no competeix amb altres màquines en aquest inici; </w:t>
+      </w:r>
+      <w:proofErr w:type="spellStart"/>
+      <w:r>
+        <w:t>sino</w:t>
+      </w:r>
+      <w:proofErr w:type="spellEnd"/>
+      <w:r>
+        <w:t xml:space="preserve"> en fer-ho com s’ha fet sempre. </w:t>
+      </w:r>
+    </w:p>
+    <w:p>
+      <w:pPr>
+        <w:jc w:val="both"/>
+      </w:pPr>
+      <w:r>
+        <w:t xml:space="preserve">La reducció de risc d’incidents, optimització en tasques, reducció cost laboral, etc. Totes les cobertures que presenta el producte, engloben una proposta de valor sòlida per al sector </w:t>
+      </w:r>
+      <w:proofErr w:type="spellStart"/>
+      <w:r>
+        <w:t>Horeca</w:t>
+      </w:r>
+      <w:proofErr w:type="spellEnd"/>
+      <w:r>
+        <w:t>, però el seu èxit dependrà de la capacitat de demostrar de manera clara i tangible el retorn econòmic davant la forta inèrcia del tall manual.</w:t>
+      </w:r>
+    </w:p>
+    <w:p>
+      <w:pPr>
+        <w:spacing w:before="240" w:after="240"/>
+        <w:jc w:val="both"/>
+      </w:pPr>
+      <w:r>
+        <w:t xml:space="preserve">Segons estudis europeus de seguretat laboral en restauració (EU-OSHA, asseguradores com Axa i Mapfre): Entre el 22% i 30% dels accidents en cuina i bars són talls amb ganivet o eines de tall i </w:t>
+      </w:r>
+      <w:proofErr w:type="spellStart"/>
+      <w:r>
+        <w:t>aproximadement</w:t>
+      </w:r>
+      <w:proofErr w:type="spellEnd"/>
+      <w:r>
+        <w:t xml:space="preserve"> el 9% dels accidents laborals es produeixen en el sector HORECA.</w:t>
+      </w:r>
+    </w:p>
+    <w:p>
+      <w:pPr>
+        <w:spacing w:before="240" w:after="240"/>
+        <w:jc w:val="both"/>
+      </w:pPr>
+      <w:r>
+        <w:t>Si ho creuem amb dades oficials d’IDESCAT on el 2025 es van registrar 121.267 accidents (60.582 amb baixa), això serien entre 2.400 i 3.200 accidents/any dels quals la meitat son amb baixa laboral. Si tenim en compte que hi ha 42.000 establiments HORECA a Catalunya, vol dir que entre el 6 i 8% dels establiments tenen un accident per talls cada any i la meitat representen baixa laboral.</w:t>
+      </w:r>
+    </w:p>
+    <w:p>
+      <w:pPr>
+        <w:jc w:val="both"/>
+      </w:pPr>
+    </w:p>
+    <w:p>
+      <w:r>
+        <w:t xml:space="preserve">Pel que fa a la Matriu d’Impacte, cal que prioritzem els factors externs que tenen fort i baix impacte i també quina probabilitat hi ha que passi. Doncs la matriu d’impacte, amb tot lo comentat, quedaria de la següent manera: </w:t>
+      </w:r>
+    </w:p>
+    <w:p>
+      <w:pPr>
+        <w:jc w:val="center"/>
+      </w:pPr>
+      <w:r>
+        <w:rPr>
+          <w:noProof/>
+        </w:rPr>
+        <w:drawing>
+          <wp:inline distT="114300" distB="114300" distL="114300" distR="114300" wp14:anchorId="036EFF0F" wp14:editId="543B9A45">
+            <wp:extent cx="4563428" cy="4563428"/>
+            <wp:effectExtent l="0" t="0" r="0" b="0"/>
+            <wp:docPr id="50018" name="image17.png"/>
+            <wp:cNvGraphicFramePr/>
+            <a:graphic xmlns:a="http://schemas.openxmlformats.org/drawingml/2006/main">
+              <a:graphicData uri="http://schemas.openxmlformats.org/drawingml/2006/picture">
+                <pic:pic xmlns:pic="http://schemas.openxmlformats.org/drawingml/2006/picture">
+                  <pic:nvPicPr>
+                    <pic:cNvPr id="13" name="image17.png"/>
+                    <pic:cNvPicPr preferRelativeResize="0"/>
+                  </pic:nvPicPr>
+                  <pic:blipFill>
+                    <a:blip r:embed="rId22"/>
+                    <a:srcRect/>
+                    <a:stretch>
+                      <a:fillRect/>
+                    </a:stretch>
+                  </pic:blipFill>
+                  <pic:spPr>
+                    <a:xfrm>
+                      <a:off x="0" y="0"/>
+                      <a:ext cx="4563428" cy="4563428"/>
+                    </a:xfrm>
+                    <a:prstGeom prst="rect">
+                      <a:avLst/>
+                    </a:prstGeom>
+                    <a:ln/>
+                  </pic:spPr>
+                </pic:pic>
+              </a:graphicData>
+            </a:graphic>
+          </wp:inline>
+        </w:drawing>
+      </w:r>
+    </w:p>
+    <w:p>
+      <w:pPr>
+        <w:jc w:val="both"/>
+      </w:pPr>
+      <w:r>
+        <w:t xml:space="preserve">La Matriu d’impacte ens permet prioritzar les accions estratègiques del projecte. En el cas de PIMPAN, les accions prioritàries són aquelles que tenen un alt impacte i baix esforç, com demostrar l’estalvi de temps i facilitar proves pilot als clients. Aquestes són clau per superar la principal barrera, que és el tall manual. Altres accions, com optimitzar costos o ampliar mercat, són important però requereixen més recursos i no es plantegen a curt termini. </w:t>
+      </w:r>
+    </w:p>
+    <w:p>
+      <w:pPr>
+        <w:jc w:val="both"/>
+      </w:pPr>
+      <w:r>
+        <w:t xml:space="preserve">La combinació del DAFO i la Matriu d’impacte-Esforç, ens permet passar d’un anàlisi descriptiu a una estratègia operativa. En el cas de PIMPAN, el principal repte és comercial: Convèncer el client que deixar el tall manual li genera valor. Per això les accions prioritàries són aquelles que permeten demostrar aquest valor de forma directa, com les proves </w:t>
+      </w:r>
+      <w:proofErr w:type="spellStart"/>
+      <w:r>
+        <w:t>pilos</w:t>
+      </w:r>
+      <w:proofErr w:type="spellEnd"/>
+      <w:r>
+        <w:t xml:space="preserve"> i les demostracions pràctiques. </w:t>
+      </w:r>
+    </w:p>
+    <w:p>
+      <w:pPr>
+        <w:jc w:val="both"/>
+      </w:pPr>
+    </w:p>
+    <w:p>
+      <w:pPr>
+        <w:pStyle w:val="Heading2"/>
+        <w:numPr>
+          <w:ilvl w:val="0"/>
+          <w:numId w:val="10"/>
+        </w:numPr>
+        <w:jc w:val="both"/>
+        <w:rPr>
+          <w:b/>
+          <w:bCs/>
+          <w:sz w:val="32"/>
+          <w:szCs w:val="32"/>
+        </w:rPr>
+      </w:pPr>
       <w:r>
         <w:rPr>
           <w:rFonts w:ascii="Arial" w:eastAsia="Arial" w:hAnsi="Arial" w:cs="Arial"/>
@@ -10917,6 +14348,14 @@
         </w:numPr>
         <w:jc w:val="both"/>
         <w:rPr>
+          <w:b/>
+          <w:bCs/>
+          <w:sz w:val="32"/>
+          <w:szCs w:val="32"/>
+        </w:rPr>
+      </w:pPr>
+      <w:r>
+        <w:rPr>
           <w:rFonts w:ascii="Arial" w:eastAsia="Arial" w:hAnsi="Arial" w:cs="Arial"/>
           <w:b/>
           <w:bCs/>
@@ -10924,9 +14363,73 @@
           <w:sz w:val="36"/>
           <w:szCs w:val="36"/>
         </w:rPr>
-      </w:pPr>
-      <w:bookmarkStart w:id="34" w:name="_heading=h.2p18euyzxbki" w:colFirst="0" w:colLast="0"/>
-      <w:bookmarkEnd w:id="34"/>
+        <w:t>Objectius</w:t>
+      </w:r>
+    </w:p>
+    <w:p>
+      <w:pPr>
+        <w:jc w:val="both"/>
+      </w:pPr>
+    </w:p>
+    <w:p>
+      <w:pPr>
+        <w:pBdr>
+          <w:top w:val="nil"/>
+          <w:left w:val="nil"/>
+          <w:bottom w:val="nil"/>
+          <w:right w:val="nil"/>
+          <w:between w:val="nil"/>
+        </w:pBdr>
+        <w:jc w:val="both"/>
+      </w:pPr>
+      <w:r>
+        <w:t xml:space="preserve">Objectiu 1: Vendre més de 400un el tercer any </w:t>
+      </w:r>
+    </w:p>
+    <w:p>
+      <w:pPr>
+        <w:pBdr>
+          <w:top w:val="nil"/>
+          <w:left w:val="nil"/>
+          <w:bottom w:val="nil"/>
+          <w:right w:val="nil"/>
+          <w:between w:val="nil"/>
+        </w:pBdr>
+        <w:jc w:val="both"/>
+      </w:pPr>
+      <w:r>
+        <w:t>Objectiu 2: Dissenyar i fabricar una segona gama de producte amb més prestacions com una pantalla tàctil on poder triar dimensions i llargades dels talls a partir del 3er any.</w:t>
+      </w:r>
+    </w:p>
+    <w:p>
+      <w:pPr>
+        <w:pBdr>
+          <w:top w:val="nil"/>
+          <w:left w:val="nil"/>
+          <w:bottom w:val="nil"/>
+          <w:right w:val="nil"/>
+          <w:between w:val="nil"/>
+        </w:pBdr>
+        <w:jc w:val="both"/>
+      </w:pPr>
+    </w:p>
+    <w:p>
+      <w:pPr>
+        <w:pStyle w:val="Heading2"/>
+        <w:numPr>
+          <w:ilvl w:val="0"/>
+          <w:numId w:val="10"/>
+        </w:numPr>
+        <w:jc w:val="both"/>
+        <w:rPr>
+          <w:rFonts w:ascii="Arial" w:eastAsia="Arial" w:hAnsi="Arial" w:cs="Arial"/>
+          <w:b/>
+          <w:bCs/>
+          <w:color w:val="000000"/>
+          <w:sz w:val="36"/>
+          <w:szCs w:val="36"/>
+        </w:rPr>
+      </w:pPr>
       <w:r>
         <w:rPr>
           <w:rFonts w:ascii="Arial" w:eastAsia="Arial" w:hAnsi="Arial" w:cs="Arial"/>
@@ -11011,8 +14514,6 @@
           <w:szCs w:val="36"/>
         </w:rPr>
       </w:pPr>
-      <w:bookmarkStart w:id="35" w:name="_heading=h.gyzovmc0idc0" w:colFirst="0" w:colLast="0"/>
-      <w:bookmarkEnd w:id="35"/>
       <w:r>
         <w:rPr>
           <w:rFonts w:ascii="Arial" w:eastAsia="Arial" w:hAnsi="Arial" w:cs="Arial"/>
@@ -11143,33 +14644,246 @@
       </w:r>
     </w:p>
     <w:p>
+      <w:pPr>
+        <w:pStyle w:val="Heading2"/>
+        <w:jc w:val="both"/>
+        <w:rPr>
+          <w:rFonts w:ascii="Arial" w:eastAsia="Arial" w:hAnsi="Arial" w:cs="Arial"/>
+          <w:color w:val="000000"/>
+        </w:rPr>
+      </w:pPr>
+      <w:r>
+        <w:br/>
+      </w:r>
+      <w:r>
+        <w:rPr>
+          <w:rFonts w:ascii="Arial" w:eastAsia="Arial" w:hAnsi="Arial" w:cs="Arial"/>
+          <w:color w:val="000000"/>
+        </w:rPr>
+        <w:t>2.3.3 Producció i tecnologia</w:t>
+      </w:r>
+    </w:p>
+    <w:p>
+      <w:pPr>
+        <w:spacing w:before="240" w:after="240"/>
+        <w:jc w:val="both"/>
+      </w:pPr>
+      <w:r>
+        <w:t xml:space="preserve">La producció es basarà en el desenvolupament de màquines de tall de pa segures, eficients i fàcils d’utilitzar. Els primers anys, la fabricació </w:t>
+      </w:r>
+      <w:proofErr w:type="spellStart"/>
+      <w:r>
+        <w:t>s’externalitzarà</w:t>
+      </w:r>
+      <w:proofErr w:type="spellEnd"/>
+      <w:r>
+        <w:t xml:space="preserve"> per reduir costos i facilitar la validació del producte abans d’assumir una estructura industrial pròpia.</w:t>
+      </w:r>
+    </w:p>
+    <w:p>
+      <w:pPr>
+        <w:spacing w:before="240" w:after="240"/>
+        <w:jc w:val="both"/>
+      </w:pPr>
+      <w:r>
+        <w:t>La tecnologia tindrà un paper clau en el projecte, tant en el disseny del producte com en la millora contínua. Es treballarà amb materials resistents i alimentaris, com acer inoxidable i plàstics aptes per a ús alimentari, garantint la seguretat i la durabilitat de les màquines.</w:t>
+      </w:r>
+    </w:p>
+    <w:p>
+      <w:pPr>
+        <w:spacing w:before="240" w:after="240"/>
+        <w:jc w:val="both"/>
+      </w:pPr>
+      <w:r>
+        <w:t>També es prioritzarà la innovació tecnològica mitjançant prototips funcionals, proves amb usuaris i futurs desenvolupaments orientats a incorporar noves funcionalitats i automatitzacions.</w:t>
+      </w:r>
+    </w:p>
+    <w:p>
+      <w:pPr>
+        <w:pStyle w:val="Heading2"/>
+        <w:jc w:val="both"/>
+        <w:rPr>
+          <w:rFonts w:ascii="Arial" w:eastAsia="Arial" w:hAnsi="Arial" w:cs="Arial"/>
+          <w:b/>
+          <w:bCs/>
+          <w:color w:val="000000"/>
+        </w:rPr>
+      </w:pPr>
+      <w:r>
+        <w:br/>
+      </w:r>
+      <w:r>
+        <w:rPr>
+          <w:rFonts w:ascii="Arial" w:eastAsia="Arial" w:hAnsi="Arial" w:cs="Arial"/>
+          <w:b/>
+          <w:bCs/>
+          <w:color w:val="000000"/>
+        </w:rPr>
+        <w:t xml:space="preserve">3.5 Anàlisi dels col·laboradors: proveïdors clau, tipus de relació, </w:t>
+      </w:r>
+      <w:proofErr w:type="spellStart"/>
+      <w:r>
+        <w:rPr>
+          <w:rFonts w:ascii="Arial" w:eastAsia="Arial" w:hAnsi="Arial" w:cs="Arial"/>
+          <w:b/>
+          <w:bCs/>
+          <w:color w:val="000000"/>
+        </w:rPr>
+        <w:t>stakeholders</w:t>
+      </w:r>
+      <w:proofErr w:type="spellEnd"/>
+      <w:r>
+        <w:rPr>
+          <w:rFonts w:ascii="Arial" w:eastAsia="Arial" w:hAnsi="Arial" w:cs="Arial"/>
+          <w:b/>
+          <w:bCs/>
+          <w:color w:val="000000"/>
+        </w:rPr>
+        <w:t xml:space="preserve"> i mapa de públics clau</w:t>
+      </w:r>
+    </w:p>
+    <w:p/>
+    <w:p>
+      <w:pPr>
+        <w:jc w:val="both"/>
+      </w:pPr>
+      <w:r>
+        <w:t xml:space="preserve">Com a proveïdors claus, cal que contactem doncs amb els proveïdors dels diferents components (Acer </w:t>
+      </w:r>
+      <w:proofErr w:type="spellStart"/>
+      <w:r>
+        <w:t>inox</w:t>
+      </w:r>
+      <w:proofErr w:type="spellEnd"/>
+      <w:r>
+        <w:t xml:space="preserve"> per estructura, talladores, motos elèctrics i components electrònics, sistemes de seguretat, sensors i proteccions); també amb proveïdors tecnològics pel que fa al prototip i el disseny industrial. </w:t>
+      </w:r>
+    </w:p>
+    <w:p>
+      <w:pPr>
+        <w:jc w:val="both"/>
+      </w:pPr>
+      <w:r>
+        <w:t xml:space="preserve">Tallers metal·lúrgics i empreses de mecanitzats per a la fabricació i </w:t>
+      </w:r>
+      <w:proofErr w:type="spellStart"/>
+      <w:r>
+        <w:t>ensamblatge</w:t>
+      </w:r>
+      <w:proofErr w:type="spellEnd"/>
+      <w:r>
+        <w:t>.</w:t>
+      </w:r>
+    </w:p>
+    <w:p>
+      <w:pPr>
+        <w:jc w:val="both"/>
+      </w:pPr>
+      <w:r>
+        <w:t>També l’empresa d’impressió de caixes i el manual.</w:t>
+      </w:r>
+    </w:p>
+    <w:p>
+      <w:pPr>
+        <w:jc w:val="both"/>
+      </w:pPr>
+      <w:r>
+        <w:t xml:space="preserve">I proveïdors logístics per tal de transportar i distribuir. </w:t>
+      </w:r>
+    </w:p>
+    <w:p>
+      <w:pPr>
+        <w:jc w:val="both"/>
+      </w:pPr>
+      <w:r>
+        <w:t xml:space="preserve">La relació amb els proveïdors a nivell d’operativa, és a curt </w:t>
+      </w:r>
+      <w:proofErr w:type="spellStart"/>
+      <w:r>
+        <w:t>plaç</w:t>
+      </w:r>
+      <w:proofErr w:type="spellEnd"/>
+      <w:r>
+        <w:t xml:space="preserve"> doncs es compra puntualment els materials. Tot i així, en el cas de desenvolupament de solucions i millora del producte cal tenir-hi relació (doncs pot haver-hi el proveïdor de les talladores on es pugui optimitzar el tall i haguem de contactar-hi..)</w:t>
+      </w:r>
+    </w:p>
+    <w:p>
+      <w:pPr>
+        <w:jc w:val="both"/>
+      </w:pPr>
+      <w:r>
+        <w:t xml:space="preserve">També a nivell d’estratègia caldrà tenir-hi relació per tal de tenir acords fiables i inclús exclusivitat. </w:t>
+      </w:r>
+    </w:p>
+    <w:p>
+      <w:pPr>
+        <w:jc w:val="both"/>
+      </w:pPr>
+      <w:r>
+        <w:t xml:space="preserve">Pel que fa als grups </w:t>
+      </w:r>
+      <w:proofErr w:type="spellStart"/>
+      <w:r>
+        <w:t>d’stakeholders</w:t>
+      </w:r>
+      <w:proofErr w:type="spellEnd"/>
+      <w:r>
+        <w:t xml:space="preserve">, cal tenir en compte (dins </w:t>
+      </w:r>
+      <w:proofErr w:type="spellStart"/>
+      <w:r>
+        <w:t>l'anàlisis</w:t>
+      </w:r>
+      <w:proofErr w:type="spellEnd"/>
+      <w:r>
+        <w:t xml:space="preserve"> extern): Col·laboradors com </w:t>
+      </w:r>
+      <w:proofErr w:type="spellStart"/>
+      <w:r>
+        <w:t>distribuidors</w:t>
+      </w:r>
+      <w:proofErr w:type="spellEnd"/>
+      <w:r>
+        <w:t xml:space="preserve">, proveïdors de peces, les financeres tipus bancs i/o inversors (en una fase inicial són importants) i la competència. </w:t>
+      </w:r>
+    </w:p>
+    <w:p>
+      <w:pPr>
+        <w:jc w:val="both"/>
+      </w:pPr>
+      <w:r>
+        <w:t xml:space="preserve">Com a baixa importància hi trobem els reguladors (normatives i demés) i el nostre propi equip intern, ja que no actuem com a públic directament. Els nostres clients i distribuïdors són els que hem de tenir més en compte ja que marquen tot el desplegament de PIMPAN i poden mostrar a mig termini el posicionament de marca que volem. </w:t>
+      </w:r>
+    </w:p>
+    <w:p>
+      <w:pPr>
+        <w:jc w:val="both"/>
+      </w:pPr>
+      <w:r>
+        <w:t xml:space="preserve">Pel que fa a Proveïdors són importants i de baixa influència. També hem volgut crear un quadre especial per a les persones usuàries, que vindrien a ser els empleats dels bar - restaurants (les persones que utilitzaran la màquina) i cal marcar-los al mapa. Doncs ells faran d’influenciadors en tots els sentits. Tenen alta </w:t>
+      </w:r>
+      <w:proofErr w:type="spellStart"/>
+      <w:r>
+        <w:t>importancia</w:t>
+      </w:r>
+      <w:proofErr w:type="spellEnd"/>
+      <w:r>
+        <w:t xml:space="preserve">, però </w:t>
+      </w:r>
+      <w:r>
+        <w:lastRenderedPageBreak/>
+        <w:t xml:space="preserve">per al funcionament general una baixa influència. Tot i així, són importants i cal incloure’ls. </w:t>
+      </w:r>
+    </w:p>
+    <w:p/>
+    <w:p>
       <w:r>
         <w:rPr>
           <w:b/>
           <w:i w:val="0"/>
           <w:color w:val="C00000"/>
         </w:rPr>
-        <w:t>[FALTA] Procés productiu i subcontractació</w:t>
-      </w:r>
-    </w:p>
-    <w:p>
-      <w:r>
-        <w:rPr>
-          <w:b/>
-          <w:i w:val="0"/>
-          <w:color w:val="C00000"/>
-        </w:rPr>
-        <w:t>[FALTA] Proveïdors i aprovisionament</w:t>
-      </w:r>
-    </w:p>
-    <w:p>
-      <w:r>
-        <w:rPr>
-          <w:b/>
-          <w:i w:val="0"/>
-          <w:color w:val="C00000"/>
-        </w:rPr>
-        <w:t>[FALTA] Logística i distribuïdors</w:t>
+        <w:t>[FALTA] Procés productiu pas a pas i logística: només hi ha el que en diu el pla de màrqueting</w:t>
       </w:r>
     </w:p>
     <w:p>
@@ -11352,8 +15066,6 @@
           <w:rFonts w:ascii="Arial" w:eastAsia="Arial" w:hAnsi="Arial" w:cs="Arial"/>
         </w:rPr>
       </w:pPr>
-      <w:bookmarkStart w:id="37" w:name="_heading=h.5ytr8fbbq4mt" w:colFirst="0" w:colLast="0"/>
-      <w:bookmarkEnd w:id="37"/>
       <w:r>
         <w:rPr>
           <w:rFonts w:ascii="Arial" w:eastAsia="Arial" w:hAnsi="Arial" w:cs="Arial"/>
@@ -12194,8 +15906,6 @@
         <w:spacing w:before="240" w:after="240"/>
         <w:jc w:val="both"/>
       </w:pPr>
-      <w:bookmarkStart w:id="39" w:name="_heading=h.s6ayeuk5klm0" w:colFirst="0" w:colLast="0"/>
-      <w:bookmarkEnd w:id="39"/>
       <w:r>
         <w:rPr>
           <w:rFonts w:ascii="Arial" w:eastAsia="Arial" w:hAnsi="Arial" w:cs="Arial"/>
@@ -13018,8 +16728,6 @@
           <w:szCs w:val="36"/>
         </w:rPr>
       </w:pPr>
-      <w:bookmarkStart w:id="40" w:name="_heading=h.lfxtxst750xk" w:colFirst="0" w:colLast="0"/>
-      <w:bookmarkEnd w:id="40"/>
       <w:r>
         <w:rPr>
           <w:rFonts w:ascii="Arial" w:eastAsia="Arial" w:hAnsi="Arial" w:cs="Arial"/>
@@ -13041,7 +16749,7 @@
           <wp:inline distT="114300" distB="114300" distL="114300" distR="114300" wp14:anchorId="0D9A2F46" wp14:editId="6F143A9D">
             <wp:extent cx="5399730" cy="7645400"/>
             <wp:effectExtent l="0" t="0" r="0" b="0"/>
-            <wp:docPr id="14" name="image4.jpg"/>
+            <wp:docPr id="50019" name="image4.jpg"/>
             <wp:cNvGraphicFramePr/>
             <a:graphic xmlns:a="http://schemas.openxmlformats.org/drawingml/2006/main">
               <a:graphicData uri="http://schemas.openxmlformats.org/drawingml/2006/picture">
@@ -13084,7 +16792,7 @@
           <wp:inline distT="114300" distB="114300" distL="114300" distR="114300" wp14:anchorId="76197CFD" wp14:editId="4ADCDB96">
             <wp:extent cx="5399730" cy="7645400"/>
             <wp:effectExtent l="0" t="0" r="0" b="0"/>
-            <wp:docPr id="15" name="image11.jpg"/>
+            <wp:docPr id="50020" name="image11.jpg"/>
             <wp:cNvGraphicFramePr/>
             <a:graphic xmlns:a="http://schemas.openxmlformats.org/drawingml/2006/main">
               <a:graphicData uri="http://schemas.openxmlformats.org/drawingml/2006/picture">
@@ -13127,7 +16835,7 @@
           <wp:inline distT="114300" distB="114300" distL="114300" distR="114300" wp14:anchorId="15E0F611" wp14:editId="724CA537">
             <wp:extent cx="5399730" cy="7645400"/>
             <wp:effectExtent l="0" t="0" r="0" b="0"/>
-            <wp:docPr id="16" name="image6.jpg"/>
+            <wp:docPr id="50021" name="image6.jpg"/>
             <wp:cNvGraphicFramePr/>
             <a:graphic xmlns:a="http://schemas.openxmlformats.org/drawingml/2006/main">
               <a:graphicData uri="http://schemas.openxmlformats.org/drawingml/2006/picture">
@@ -13170,7 +16878,7 @@
           <wp:inline distT="114300" distB="114300" distL="114300" distR="114300" wp14:anchorId="016B3448" wp14:editId="08C16708">
             <wp:extent cx="5399730" cy="7645400"/>
             <wp:effectExtent l="0" t="0" r="0" b="0"/>
-            <wp:docPr id="17" name="image14.jpg"/>
+            <wp:docPr id="50022" name="image14.jpg"/>
             <wp:cNvGraphicFramePr/>
             <a:graphic xmlns:a="http://schemas.openxmlformats.org/drawingml/2006/main">
               <a:graphicData uri="http://schemas.openxmlformats.org/drawingml/2006/picture">
@@ -13213,7 +16921,7 @@
           <wp:inline distT="114300" distB="114300" distL="114300" distR="114300" wp14:anchorId="7E9A4C36" wp14:editId="006AA2B4">
             <wp:extent cx="5399730" cy="7645400"/>
             <wp:effectExtent l="0" t="0" r="0" b="0"/>
-            <wp:docPr id="18" name="image7.jpg"/>
+            <wp:docPr id="50023" name="image7.jpg"/>
             <wp:cNvGraphicFramePr/>
             <a:graphic xmlns:a="http://schemas.openxmlformats.org/drawingml/2006/main">
               <a:graphicData uri="http://schemas.openxmlformats.org/drawingml/2006/picture">
@@ -13256,7 +16964,7 @@
           <wp:inline distT="114300" distB="114300" distL="114300" distR="114300" wp14:anchorId="15F07E7A" wp14:editId="4630D2CE">
             <wp:extent cx="5399730" cy="7645400"/>
             <wp:effectExtent l="0" t="0" r="0" b="0"/>
-            <wp:docPr id="19" name="image2.jpg"/>
+            <wp:docPr id="50024" name="image2.jpg"/>
             <wp:cNvGraphicFramePr/>
             <a:graphic xmlns:a="http://schemas.openxmlformats.org/drawingml/2006/main">
               <a:graphicData uri="http://schemas.openxmlformats.org/drawingml/2006/picture">
@@ -13484,7 +17192,7 @@
     </w:lvl>
   </w:abstractNum>
   <w:abstractNum xmlns:w15="http://schemas.microsoft.com/office/word/2012/wordml" w:abstractNumId="9" w15:restartNumberingAfterBreak="0">
-    <w:nsid w:val="03145C25"/>
+    <w:nsid w:val="01128B55"/>
     <w:multiLevelType w:val="multilevel"/>
     <w:tmpl w:val="5052E854"/>
     <w:lvl w:ilvl="0">
@@ -13603,7 +17311,7 @@
     </w:lvl>
   </w:abstractNum>
   <w:abstractNum xmlns:w15="http://schemas.microsoft.com/office/word/2012/wordml" w:abstractNumId="10" w15:restartNumberingAfterBreak="0">
-    <w:nsid w:val="019662C2"/>
+    <w:nsid w:val="04E807D6"/>
     <w:multiLevelType w:val="multilevel"/>
     <w:tmpl w:val="A78C1E9A"/>
     <w:lvl w:ilvl="0">
@@ -13717,7 +17425,7 @@
     </w:lvl>
   </w:abstractNum>
   <w:abstractNum xmlns:w15="http://schemas.microsoft.com/office/word/2012/wordml" w:abstractNumId="11" w15:restartNumberingAfterBreak="0">
-    <w:nsid w:val="006C4DA4"/>
+    <w:nsid w:val="00D9336E"/>
     <w:multiLevelType w:val="multilevel"/>
     <w:tmpl w:val="A2DC5818"/>
     <w:lvl w:ilvl="0">
@@ -13837,7 +17545,7 @@
     </w:lvl>
   </w:abstractNum>
   <w:abstractNum xmlns:w15="http://schemas.microsoft.com/office/word/2012/wordml" w:abstractNumId="12" w15:restartNumberingAfterBreak="0">
-    <w:nsid w:val="01227333"/>
+    <w:nsid w:val="01AA1DFE"/>
     <w:multiLevelType w:val="multilevel"/>
     <w:tmpl w:val="24FE8AF8"/>
     <w:lvl w:ilvl="0">
@@ -13950,7 +17658,7 @@
     </w:lvl>
   </w:abstractNum>
   <w:abstractNum xmlns:w15="http://schemas.microsoft.com/office/word/2012/wordml" w:abstractNumId="13" w15:restartNumberingAfterBreak="0">
-    <w:nsid w:val="03A69741"/>
+    <w:nsid w:val="0111538E"/>
     <w:multiLevelType w:val="multilevel"/>
     <w:tmpl w:val="C5D630AE"/>
     <w:lvl w:ilvl="0">
@@ -14063,7 +17771,7 @@
     </w:lvl>
   </w:abstractNum>
   <w:abstractNum xmlns:w15="http://schemas.microsoft.com/office/word/2012/wordml" w:abstractNumId="14" w15:restartNumberingAfterBreak="0">
-    <w:nsid w:val="0436CB96"/>
+    <w:nsid w:val="02E21172"/>
     <w:multiLevelType w:val="multilevel"/>
     <w:tmpl w:val="E4FEA6C8"/>
     <w:lvl w:ilvl="0">
@@ -14194,7 +17902,7 @@
     </w:lvl>
   </w:abstractNum>
   <w:abstractNum xmlns:w15="http://schemas.microsoft.com/office/word/2012/wordml" w:abstractNumId="15" w15:restartNumberingAfterBreak="0">
-    <w:nsid w:val="040B8E45"/>
+    <w:nsid w:val="0005952A"/>
     <w:multiLevelType w:val="multilevel"/>
     <w:tmpl w:val="A0CAF5B4"/>
     <w:lvl w:ilvl="0">
@@ -14307,7 +18015,7 @@
     </w:lvl>
   </w:abstractNum>
   <w:abstractNum xmlns:w15="http://schemas.microsoft.com/office/word/2012/wordml" w:abstractNumId="16" w15:restartNumberingAfterBreak="0">
-    <w:nsid w:val="05DC8665"/>
+    <w:nsid w:val="05E11334"/>
     <w:multiLevelType w:val="multilevel"/>
     <w:tmpl w:val="8CFAF792"/>
     <w:lvl w:ilvl="0">
@@ -14420,7 +18128,7 @@
     </w:lvl>
   </w:abstractNum>
   <w:abstractNum xmlns:w15="http://schemas.microsoft.com/office/word/2012/wordml" w:abstractNumId="17" w15:restartNumberingAfterBreak="0">
-    <w:nsid w:val="03532607"/>
+    <w:nsid w:val="0453CF9F"/>
     <w:multiLevelType w:val="multilevel"/>
     <w:tmpl w:val="34CE541C"/>
     <w:lvl w:ilvl="0">
@@ -14533,7 +18241,7 @@
     </w:lvl>
   </w:abstractNum>
   <w:abstractNum xmlns:w15="http://schemas.microsoft.com/office/word/2012/wordml" w:abstractNumId="18" w15:restartNumberingAfterBreak="0">
-    <w:nsid w:val="04DC937A"/>
+    <w:nsid w:val="003DCEA4"/>
     <w:multiLevelType w:val="multilevel"/>
     <w:tmpl w:val="AF0AAAAE"/>
     <w:lvl w:ilvl="0">
@@ -14646,7 +18354,7 @@
     </w:lvl>
   </w:abstractNum>
   <w:abstractNum xmlns:w15="http://schemas.microsoft.com/office/word/2012/wordml" w:abstractNumId="19" w15:restartNumberingAfterBreak="0">
-    <w:nsid w:val="01F92581"/>
+    <w:nsid w:val="01936BB4"/>
     <w:multiLevelType w:val="multilevel"/>
     <w:tmpl w:val="CFD498A2"/>
     <w:lvl w:ilvl="0">
@@ -14759,7 +18467,7 @@
     </w:lvl>
   </w:abstractNum>
   <w:abstractNum xmlns:w15="http://schemas.microsoft.com/office/word/2012/wordml" w:abstractNumId="20" w15:restartNumberingAfterBreak="0">
-    <w:nsid w:val="00EE0B72"/>
+    <w:nsid w:val="02E14D3A"/>
     <w:multiLevelType w:val="multilevel"/>
     <w:tmpl w:val="AB50CD80"/>
     <w:lvl w:ilvl="0">
@@ -14872,7 +18580,7 @@
     </w:lvl>
   </w:abstractNum>
   <w:abstractNum xmlns:w15="http://schemas.microsoft.com/office/word/2012/wordml" w:abstractNumId="21" w15:restartNumberingAfterBreak="0">
-    <w:nsid w:val="04C3FD40"/>
+    <w:nsid w:val="0138D784"/>
     <w:multiLevelType w:val="multilevel"/>
     <w:tmpl w:val="5A62F66A"/>
     <w:lvl w:ilvl="0">
@@ -15003,7 +18711,7 @@
     </w:lvl>
   </w:abstractNum>
   <w:abstractNum xmlns:w15="http://schemas.microsoft.com/office/word/2012/wordml" w:abstractNumId="22" w15:restartNumberingAfterBreak="0">
-    <w:nsid w:val="058C5C68"/>
+    <w:nsid w:val="05D6E3CD"/>
     <w:multiLevelType w:val="multilevel"/>
     <w:tmpl w:val="A2F2AE10"/>
     <w:lvl w:ilvl="0">
@@ -15116,7 +18824,7 @@
     </w:lvl>
   </w:abstractNum>
   <w:abstractNum xmlns:w15="http://schemas.microsoft.com/office/word/2012/wordml" w:abstractNumId="23" w15:restartNumberingAfterBreak="0">
-    <w:nsid w:val="034285C0"/>
+    <w:nsid w:val="037FAB59"/>
     <w:multiLevelType w:val="multilevel"/>
     <w:tmpl w:val="4D9CE1AE"/>
     <w:lvl w:ilvl="0">
@@ -15229,7 +18937,7 @@
     </w:lvl>
   </w:abstractNum>
   <w:abstractNum xmlns:w15="http://schemas.microsoft.com/office/word/2012/wordml" w:abstractNumId="24" w15:restartNumberingAfterBreak="0">
-    <w:nsid w:val="032104D1"/>
+    <w:nsid w:val="03A390E9"/>
     <w:multiLevelType w:val="multilevel"/>
     <w:tmpl w:val="49B29048"/>
     <w:lvl w:ilvl="0">
@@ -15342,7 +19050,7 @@
     </w:lvl>
   </w:abstractNum>
   <w:abstractNum xmlns:w15="http://schemas.microsoft.com/office/word/2012/wordml" w:abstractNumId="25" w15:restartNumberingAfterBreak="0">
-    <w:nsid w:val="032F79FE"/>
+    <w:nsid w:val="01F2054B"/>
     <w:multiLevelType w:val="multilevel"/>
     <w:tmpl w:val="FA5C2860"/>
     <w:lvl w:ilvl="0">
@@ -15455,7 +19163,7 @@
     </w:lvl>
   </w:abstractNum>
   <w:abstractNum xmlns:w15="http://schemas.microsoft.com/office/word/2012/wordml" w:abstractNumId="26" w15:restartNumberingAfterBreak="0">
-    <w:nsid w:val="0441769C"/>
+    <w:nsid w:val="05258CD3"/>
     <w:multiLevelType w:val="multilevel"/>
     <w:tmpl w:val="F356B72A"/>
     <w:lvl w:ilvl="0">
@@ -15568,7 +19276,7 @@
     </w:lvl>
   </w:abstractNum>
   <w:abstractNum xmlns:w15="http://schemas.microsoft.com/office/word/2012/wordml" w:abstractNumId="27" w15:restartNumberingAfterBreak="0">
-    <w:nsid w:val="0350B94E"/>
+    <w:nsid w:val="01EA19DD"/>
     <w:multiLevelType w:val="multilevel"/>
     <w:tmpl w:val="E1504D84"/>
     <w:lvl w:ilvl="0">
@@ -15688,7 +19396,7 @@
     </w:lvl>
   </w:abstractNum>
   <w:abstractNum xmlns:w15="http://schemas.microsoft.com/office/word/2012/wordml" w:abstractNumId="28" w15:restartNumberingAfterBreak="0">
-    <w:nsid w:val="01E3606E"/>
+    <w:nsid w:val="019C81A5"/>
     <w:multiLevelType w:val="multilevel"/>
     <w:tmpl w:val="5C64FF52"/>
     <w:lvl w:ilvl="0">
@@ -15801,7 +19509,7 @@
     </w:lvl>
   </w:abstractNum>
   <w:abstractNum xmlns:w15="http://schemas.microsoft.com/office/word/2012/wordml" w:abstractNumId="29" w15:restartNumberingAfterBreak="0">
-    <w:nsid w:val="03C0BECC"/>
+    <w:nsid w:val="0359763A"/>
     <w:multiLevelType w:val="multilevel"/>
     <w:tmpl w:val="ADD68BA8"/>
     <w:lvl w:ilvl="0">
@@ -15914,7 +19622,7 @@
     </w:lvl>
   </w:abstractNum>
   <w:abstractNum xmlns:w15="http://schemas.microsoft.com/office/word/2012/wordml" w:abstractNumId="30" w15:restartNumberingAfterBreak="0">
-    <w:nsid w:val="0489E603"/>
+    <w:nsid w:val="02C24AE4"/>
     <w:multiLevelType w:val="multilevel"/>
     <w:tmpl w:val="1D04A704"/>
     <w:lvl w:ilvl="0">
@@ -16027,7 +19735,7 @@
     </w:lvl>
   </w:abstractNum>
   <w:abstractNum xmlns:w15="http://schemas.microsoft.com/office/word/2012/wordml" w:abstractNumId="31" w15:restartNumberingAfterBreak="0">
-    <w:nsid w:val="026CFA54"/>
+    <w:nsid w:val="04EF216F"/>
     <w:multiLevelType w:val="multilevel"/>
     <w:tmpl w:val="459A8DBE"/>
     <w:lvl w:ilvl="0">
@@ -16140,7 +19848,7 @@
     </w:lvl>
   </w:abstractNum>
   <w:abstractNum xmlns:w15="http://schemas.microsoft.com/office/word/2012/wordml" w:abstractNumId="32" w15:restartNumberingAfterBreak="0">
-    <w:nsid w:val="01188BE3"/>
+    <w:nsid w:val="01658311"/>
     <w:multiLevelType w:val="multilevel"/>
     <w:tmpl w:val="8A7C5C6A"/>
     <w:lvl w:ilvl="0">
@@ -16253,7 +19961,7 @@
     </w:lvl>
   </w:abstractNum>
   <w:abstractNum xmlns:w15="http://schemas.microsoft.com/office/word/2012/wordml" w:abstractNumId="33" w15:restartNumberingAfterBreak="0">
-    <w:nsid w:val="025DE2DD"/>
+    <w:nsid w:val="01715532"/>
     <w:multiLevelType w:val="multilevel"/>
     <w:tmpl w:val="50E0F5F2"/>
     <w:lvl w:ilvl="0">
@@ -16366,7 +20074,7 @@
     </w:lvl>
   </w:abstractNum>
   <w:abstractNum xmlns:w15="http://schemas.microsoft.com/office/word/2012/wordml" w:abstractNumId="34" w15:restartNumberingAfterBreak="0">
-    <w:nsid w:val="0449C1F2"/>
+    <w:nsid w:val="00A69395"/>
     <w:multiLevelType w:val="multilevel"/>
     <w:tmpl w:val="E826A766"/>
     <w:lvl w:ilvl="0">
@@ -16479,7 +20187,7 @@
     </w:lvl>
   </w:abstractNum>
   <w:abstractNum xmlns:w15="http://schemas.microsoft.com/office/word/2012/wordml" w:abstractNumId="35" w15:restartNumberingAfterBreak="0">
-    <w:nsid w:val="04824EC6"/>
+    <w:nsid w:val="025B1599"/>
     <w:multiLevelType w:val="multilevel"/>
     <w:tmpl w:val="AFD88F34"/>
     <w:lvl w:ilvl="0">
@@ -16592,7 +20300,7 @@
     </w:lvl>
   </w:abstractNum>
   <w:abstractNum xmlns:w15="http://schemas.microsoft.com/office/word/2012/wordml" w:abstractNumId="36" w15:restartNumberingAfterBreak="0">
-    <w:nsid w:val="01A56B91"/>
+    <w:nsid w:val="04586CDE"/>
     <w:multiLevelType w:val="multilevel"/>
     <w:tmpl w:val="954603A2"/>
     <w:lvl w:ilvl="0">
@@ -16705,7 +20413,7 @@
     </w:lvl>
   </w:abstractNum>
   <w:abstractNum xmlns:w15="http://schemas.microsoft.com/office/word/2012/wordml" w:abstractNumId="37" w15:restartNumberingAfterBreak="0">
-    <w:nsid w:val="059A5269"/>
+    <w:nsid w:val="027E0BAB"/>
     <w:multiLevelType w:val="multilevel"/>
     <w:tmpl w:val="AAE21024"/>
     <w:lvl w:ilvl="0">
@@ -16818,7 +20526,7 @@
     </w:lvl>
   </w:abstractNum>
   <w:abstractNum xmlns:w15="http://schemas.microsoft.com/office/word/2012/wordml" w:abstractNumId="38" w15:restartNumberingAfterBreak="0">
-    <w:nsid w:val="04FA6773"/>
+    <w:nsid w:val="050820C6"/>
     <w:multiLevelType w:val="multilevel"/>
     <w:tmpl w:val="AA0050B2"/>
     <w:lvl w:ilvl="0">
@@ -16931,7 +20639,7 @@
     </w:lvl>
   </w:abstractNum>
   <w:abstractNum xmlns:w15="http://schemas.microsoft.com/office/word/2012/wordml" w:abstractNumId="39" w15:restartNumberingAfterBreak="0">
-    <w:nsid w:val="0081C0F0"/>
+    <w:nsid w:val="04154363"/>
     <w:multiLevelType w:val="multilevel"/>
     <w:tmpl w:val="BF38600A"/>
     <w:lvl w:ilvl="0">
@@ -17044,7 +20752,7 @@
     </w:lvl>
   </w:abstractNum>
   <w:abstractNum xmlns:w15="http://schemas.microsoft.com/office/word/2012/wordml" w:abstractNumId="40" w15:restartNumberingAfterBreak="0">
-    <w:nsid w:val="03DA935E"/>
+    <w:nsid w:val="05CBDE10"/>
     <w:multiLevelType w:val="multilevel"/>
     <w:tmpl w:val="03182B48"/>
     <w:lvl w:ilvl="0">
@@ -17157,7 +20865,7 @@
     </w:lvl>
   </w:abstractNum>
   <w:abstractNum xmlns:w15="http://schemas.microsoft.com/office/word/2012/wordml" w:abstractNumId="41" w15:restartNumberingAfterBreak="0">
-    <w:nsid w:val="05DE992F"/>
+    <w:nsid w:val="04BAA4CB"/>
     <w:multiLevelType w:val="multilevel"/>
     <w:tmpl w:val="87ECECFA"/>
     <w:lvl w:ilvl="0">

</xml_diff>